<commit_message>
fix: update DevOps resume document for clarity and formatting
</commit_message>
<xml_diff>
--- a/public/Rohit_More_Resume_DevOps.docx
+++ b/public/Rohit_More_Resume_DevOps.docx
@@ -717,7 +717,17 @@
           <w:sz w:val="19"/>
           <w:szCs w:val="19"/>
         </w:rPr>
-        <w:t>Practical, self-directed learning outside of professional work — not production experience:</w:t>
+        <w:t>Practical, self-directed learning outside of professional work</w:t>
+      </w:r>
+      <w:r>
+        <w:rPr>
+          <w:i/>
+          <w:iCs/>
+          <w:color w:val="555555"/>
+          <w:sz w:val="19"/>
+          <w:szCs w:val="19"/>
+        </w:rPr>
+        <w:t>:</w:t>
       </w:r>
     </w:p>
     <w:p>

</xml_diff>

<commit_message>
feat: update resume documents and links for improved clarity and new content
</commit_message>
<xml_diff>
--- a/public/Rohit_More_Resume_DevOps.docx
+++ b/public/Rohit_More_Resume_DevOps.docx
@@ -6,93 +6,145 @@
       <w:pPr>
         <w:spacing w:after="40"/>
         <w:jc w:val="center"/>
-      </w:pPr>
-      <w:r>
-        <w:rPr>
+        <w:rPr>
+          <w:rFonts w:asciiTheme="minorHAnsi" w:hAnsiTheme="minorHAnsi" w:cstheme="minorHAnsi"/>
           <w:b/>
           <w:bCs/>
           <w:color w:val="1F2937"/>
           <w:sz w:val="36"/>
           <w:szCs w:val="36"/>
         </w:rPr>
+      </w:pPr>
+      <w:r>
+        <w:rPr>
+          <w:rFonts w:asciiTheme="minorHAnsi" w:hAnsiTheme="minorHAnsi" w:cstheme="minorHAnsi"/>
+          <w:b/>
+          <w:bCs/>
+          <w:color w:val="1F2937"/>
+          <w:sz w:val="36"/>
+          <w:szCs w:val="36"/>
+        </w:rPr>
         <w:t>Rohit More</w:t>
       </w:r>
     </w:p>
     <w:p>
       <w:pPr>
-        <w:spacing w:after="200"/>
+        <w:spacing w:after="40"/>
         <w:jc w:val="center"/>
-      </w:pPr>
-      <w:r>
-        <w:rPr>
+        <w:rPr>
+          <w:rFonts w:asciiTheme="minorHAnsi" w:hAnsiTheme="minorHAnsi" w:cstheme="minorHAnsi"/>
+          <w:sz w:val="18"/>
+          <w:szCs w:val="18"/>
+        </w:rPr>
+      </w:pPr>
+      <w:r>
+        <w:rPr>
+          <w:rFonts w:asciiTheme="minorHAnsi" w:hAnsiTheme="minorHAnsi" w:cstheme="minorHAnsi"/>
+          <w:sz w:val="18"/>
+          <w:szCs w:val="18"/>
+        </w:rPr>
+        <w:t xml:space="preserve">DevOps Engineer | AWS • Docker • CI/CD • Linux | Production Infrastructure &amp; </w:t>
+      </w:r>
+      <w:r>
+        <w:rPr>
+          <w:rFonts w:asciiTheme="minorHAnsi" w:hAnsiTheme="minorHAnsi" w:cstheme="minorHAnsi"/>
+          <w:sz w:val="18"/>
+          <w:szCs w:val="18"/>
+        </w:rPr>
+        <w:t>Open-Source</w:t>
+      </w:r>
+      <w:r>
+        <w:rPr>
+          <w:rFonts w:asciiTheme="minorHAnsi" w:hAnsiTheme="minorHAnsi" w:cstheme="minorHAnsi"/>
+          <w:sz w:val="18"/>
+          <w:szCs w:val="18"/>
+        </w:rPr>
+        <w:t xml:space="preserve"> Networking Projects</w:t>
+      </w:r>
+    </w:p>
+    <w:p>
+      <w:pPr>
+        <w:jc w:val="center"/>
+        <w:rPr>
+          <w:rFonts w:asciiTheme="minorHAnsi" w:hAnsiTheme="minorHAnsi" w:cstheme="minorHAnsi"/>
+        </w:rPr>
+      </w:pPr>
+      <w:r>
+        <w:rPr>
+          <w:rFonts w:asciiTheme="minorHAnsi" w:hAnsiTheme="minorHAnsi" w:cstheme="minorHAnsi"/>
           <w:color w:val="555555"/>
           <w:sz w:val="19"/>
           <w:szCs w:val="19"/>
         </w:rPr>
         <w:t>+91-</w:t>
       </w:r>
-      <w:proofErr w:type="gramStart"/>
-      <w:r>
-        <w:rPr>
+      <w:r>
+        <w:rPr>
+          <w:rFonts w:asciiTheme="minorHAnsi" w:hAnsiTheme="minorHAnsi" w:cstheme="minorHAnsi"/>
           <w:color w:val="555555"/>
           <w:sz w:val="19"/>
           <w:szCs w:val="19"/>
         </w:rPr>
-        <w:t>9512418859  |</w:t>
-      </w:r>
-      <w:proofErr w:type="gramEnd"/>
-      <w:r>
-        <w:rPr>
+        <w:t>9512418859 |</w:t>
+      </w:r>
+      <w:r>
+        <w:rPr>
+          <w:rFonts w:asciiTheme="minorHAnsi" w:hAnsiTheme="minorHAnsi" w:cstheme="minorHAnsi"/>
+          <w:color w:val="000000" w:themeColor="text1"/>
+          <w:sz w:val="19"/>
+          <w:szCs w:val="19"/>
+        </w:rPr>
+        <w:t xml:space="preserve"> rohitmore.dev@gmail.com |</w:t>
+      </w:r>
+      <w:r>
+        <w:rPr>
+          <w:rFonts w:asciiTheme="minorHAnsi" w:hAnsiTheme="minorHAnsi" w:cstheme="minorHAnsi"/>
           <w:color w:val="555555"/>
           <w:sz w:val="19"/>
           <w:szCs w:val="19"/>
         </w:rPr>
-        <w:t xml:space="preserve">  </w:t>
-      </w:r>
-      <w:proofErr w:type="gramStart"/>
-      <w:r>
-        <w:rPr>
-          <w:color w:val="1D4ED8"/>
-          <w:sz w:val="19"/>
-          <w:szCs w:val="19"/>
-        </w:rPr>
-        <w:t>rohitmore.dev@gmail.com</w:t>
-      </w:r>
-      <w:r>
-        <w:rPr>
-          <w:color w:val="555555"/>
-          <w:sz w:val="19"/>
-          <w:szCs w:val="19"/>
-        </w:rPr>
-        <w:t xml:space="preserve">  |</w:t>
-      </w:r>
-      <w:proofErr w:type="gramEnd"/>
-      <w:r>
-        <w:rPr>
-          <w:color w:val="555555"/>
-          <w:sz w:val="19"/>
-          <w:szCs w:val="19"/>
-        </w:rPr>
-        <w:t xml:space="preserve">  </w:t>
-      </w:r>
-      <w:r>
-        <w:rPr>
-          <w:color w:val="1D4ED8"/>
-          <w:sz w:val="19"/>
-          <w:szCs w:val="19"/>
-        </w:rPr>
-        <w:t>github.com/</w:t>
-      </w:r>
-      <w:proofErr w:type="spellStart"/>
-      <w:r>
-        <w:rPr>
-          <w:color w:val="1D4ED8"/>
-          <w:sz w:val="19"/>
-          <w:szCs w:val="19"/>
-        </w:rPr>
-        <w:t>rohitbytecode</w:t>
-      </w:r>
-      <w:proofErr w:type="spellEnd"/>
+        <w:t xml:space="preserve"> </w:t>
+      </w:r>
+      <w:hyperlink r:id="rId7" w:history="1">
+        <w:r>
+          <w:rPr>
+            <w:rStyle w:val="Hyperlink"/>
+            <w:rFonts w:asciiTheme="minorHAnsi" w:hAnsiTheme="minorHAnsi" w:cstheme="minorHAnsi"/>
+            <w:sz w:val="19"/>
+            <w:szCs w:val="19"/>
+          </w:rPr>
+          <w:t>github.co</w:t>
+        </w:r>
+        <w:r>
+          <w:rPr>
+            <w:rStyle w:val="Hyperlink"/>
+            <w:rFonts w:asciiTheme="minorHAnsi" w:hAnsiTheme="minorHAnsi" w:cstheme="minorHAnsi"/>
+            <w:sz w:val="19"/>
+            <w:szCs w:val="19"/>
+          </w:rPr>
+          <w:t>m</w:t>
+        </w:r>
+        <w:r>
+          <w:rPr>
+            <w:rStyle w:val="Hyperlink"/>
+            <w:rFonts w:asciiTheme="minorHAnsi" w:hAnsiTheme="minorHAnsi" w:cstheme="minorHAnsi"/>
+            <w:sz w:val="19"/>
+            <w:szCs w:val="19"/>
+          </w:rPr>
+          <w:t>/</w:t>
+        </w:r>
+        <w:proofErr w:type="spellStart"/>
+        <w:r>
+          <w:rPr>
+            <w:rStyle w:val="Hyperlink"/>
+            <w:rFonts w:asciiTheme="minorHAnsi" w:hAnsiTheme="minorHAnsi" w:cstheme="minorHAnsi"/>
+            <w:sz w:val="19"/>
+            <w:szCs w:val="19"/>
+          </w:rPr>
+          <w:t>rohitbytecode</w:t>
+        </w:r>
+        <w:proofErr w:type="spellEnd"/>
+      </w:hyperlink>
     </w:p>
     <w:p>
       <w:pPr>
@@ -100,9 +152,13 @@
           <w:bottom w:val="single" w:sz="4" w:space="2" w:color="1F2937"/>
         </w:pBdr>
         <w:spacing w:before="90" w:after="40"/>
-      </w:pPr>
-      <w:r>
-        <w:rPr>
+        <w:rPr>
+          <w:rFonts w:asciiTheme="minorHAnsi" w:hAnsiTheme="minorHAnsi" w:cstheme="minorHAnsi"/>
+        </w:rPr>
+      </w:pPr>
+      <w:r>
+        <w:rPr>
+          <w:rFonts w:asciiTheme="minorHAnsi" w:hAnsiTheme="minorHAnsi" w:cstheme="minorHAnsi"/>
           <w:b/>
           <w:bCs/>
           <w:color w:val="1F2937"/>
@@ -114,16 +170,40 @@
     <w:p>
       <w:pPr>
         <w:spacing w:after="100"/>
-      </w:pPr>
-      <w:r>
-        <w:t xml:space="preserve">Software Engineer with 2+ years of hands-on experience deploying, monitoring, and maintaining production infrastructure for a healthcare SaaS platform. Responsible for the full deployment lifecycle on AWS — EC2 provisioning, IAM and Security Group configuration, Nginx reverse proxy/HTTPS setup, PM2 process management, and CI/CD pipelines via GitHub Actions. Experienced diagnosing infrastructure and networking issues (LAN connectivity, port exhaustion, TLS misconfiguration) in live production environments, and building observability stacks with Prometheus, </w:t>
+        <w:rPr>
+          <w:rFonts w:asciiTheme="minorHAnsi" w:hAnsiTheme="minorHAnsi" w:cstheme="minorHAnsi"/>
+        </w:rPr>
+      </w:pPr>
+      <w:r>
+        <w:rPr>
+          <w:rFonts w:asciiTheme="minorHAnsi" w:hAnsiTheme="minorHAnsi" w:cstheme="minorHAnsi"/>
+        </w:rPr>
+        <w:t xml:space="preserve">Software Engineer with 2+ years of hands-on experience deploying, monitoring, and maintaining production infrastructure for a healthcare SaaS platform. Responsible for the full deployment lifecycle on AWS </w:t>
+      </w:r>
+      <w:r>
+        <w:rPr>
+          <w:rFonts w:asciiTheme="minorHAnsi" w:hAnsiTheme="minorHAnsi" w:cstheme="minorHAnsi"/>
+        </w:rPr>
+        <w:t>-</w:t>
+      </w:r>
+      <w:r>
+        <w:rPr>
+          <w:rFonts w:asciiTheme="minorHAnsi" w:hAnsiTheme="minorHAnsi" w:cstheme="minorHAnsi"/>
+        </w:rPr>
+        <w:t xml:space="preserve"> EC2 provisioning, IAM and Security Group configuration, Nginx reverse proxy/HTTPS setup, PM2 process management, and CI/CD pipelines via GitHub Actions. Experienced diagnosing infrastructure and networking issues (LAN connectivity, port exhaustion, TLS misconfiguration) in live production environments, and building observability stacks with Prometheus, </w:t>
       </w:r>
       <w:proofErr w:type="spellStart"/>
       <w:r>
+        <w:rPr>
+          <w:rFonts w:asciiTheme="minorHAnsi" w:hAnsiTheme="minorHAnsi" w:cstheme="minorHAnsi"/>
+        </w:rPr>
         <w:t>OpenTelemetry</w:t>
       </w:r>
       <w:proofErr w:type="spellEnd"/>
       <w:r>
+        <w:rPr>
+          <w:rFonts w:asciiTheme="minorHAnsi" w:hAnsiTheme="minorHAnsi" w:cstheme="minorHAnsi"/>
+        </w:rPr>
         <w:t>, and structured logging. Self-directed learner actively building practical experience with Kubernetes, Jenkins, GitLab CI/CD, and Terraform.</w:t>
       </w:r>
     </w:p>
@@ -133,9 +213,13 @@
           <w:bottom w:val="single" w:sz="4" w:space="2" w:color="1F2937"/>
         </w:pBdr>
         <w:spacing w:before="90" w:after="40"/>
-      </w:pPr>
-      <w:r>
-        <w:rPr>
+        <w:rPr>
+          <w:rFonts w:asciiTheme="minorHAnsi" w:hAnsiTheme="minorHAnsi" w:cstheme="minorHAnsi"/>
+        </w:rPr>
+      </w:pPr>
+      <w:r>
+        <w:rPr>
+          <w:rFonts w:asciiTheme="minorHAnsi" w:hAnsiTheme="minorHAnsi" w:cstheme="minorHAnsi"/>
           <w:b/>
           <w:bCs/>
           <w:color w:val="1F2937"/>
@@ -147,84 +231,123 @@
     <w:p>
       <w:pPr>
         <w:spacing w:after="30"/>
-      </w:pPr>
-      <w:r>
-        <w:rPr>
+        <w:rPr>
+          <w:rFonts w:asciiTheme="minorHAnsi" w:hAnsiTheme="minorHAnsi" w:cstheme="minorHAnsi"/>
+        </w:rPr>
+      </w:pPr>
+      <w:r>
+        <w:rPr>
+          <w:rFonts w:asciiTheme="minorHAnsi" w:hAnsiTheme="minorHAnsi" w:cstheme="minorHAnsi"/>
           <w:b/>
           <w:bCs/>
         </w:rPr>
         <w:t xml:space="preserve">Operating Systems: </w:t>
       </w:r>
       <w:r>
+        <w:rPr>
+          <w:rFonts w:asciiTheme="minorHAnsi" w:hAnsiTheme="minorHAnsi" w:cstheme="minorHAnsi"/>
+        </w:rPr>
         <w:t>Linux (Ubuntu), Windows Server</w:t>
       </w:r>
     </w:p>
     <w:p>
       <w:pPr>
         <w:spacing w:after="30"/>
-      </w:pPr>
-      <w:r>
-        <w:rPr>
+        <w:rPr>
+          <w:rFonts w:asciiTheme="minorHAnsi" w:hAnsiTheme="minorHAnsi" w:cstheme="minorHAnsi"/>
+        </w:rPr>
+      </w:pPr>
+      <w:r>
+        <w:rPr>
+          <w:rFonts w:asciiTheme="minorHAnsi" w:hAnsiTheme="minorHAnsi" w:cstheme="minorHAnsi"/>
           <w:b/>
           <w:bCs/>
         </w:rPr>
         <w:t xml:space="preserve">Scripting: </w:t>
       </w:r>
       <w:r>
+        <w:rPr>
+          <w:rFonts w:asciiTheme="minorHAnsi" w:hAnsiTheme="minorHAnsi" w:cstheme="minorHAnsi"/>
+        </w:rPr>
         <w:t>Bash (task automation scripts), Node.js scripting</w:t>
       </w:r>
     </w:p>
     <w:p>
       <w:pPr>
         <w:spacing w:after="30"/>
-      </w:pPr>
-      <w:r>
-        <w:rPr>
+        <w:rPr>
+          <w:rFonts w:asciiTheme="minorHAnsi" w:hAnsiTheme="minorHAnsi" w:cstheme="minorHAnsi"/>
+        </w:rPr>
+      </w:pPr>
+      <w:r>
+        <w:rPr>
+          <w:rFonts w:asciiTheme="minorHAnsi" w:hAnsiTheme="minorHAnsi" w:cstheme="minorHAnsi"/>
           <w:b/>
           <w:bCs/>
         </w:rPr>
         <w:t xml:space="preserve">Version Control &amp; CI/CD: </w:t>
       </w:r>
       <w:r>
+        <w:rPr>
+          <w:rFonts w:asciiTheme="minorHAnsi" w:hAnsiTheme="minorHAnsi" w:cstheme="minorHAnsi"/>
+        </w:rPr>
         <w:t>Git, GitHub, GitHub Actions (production CI/CD pipelines)</w:t>
       </w:r>
     </w:p>
     <w:p>
       <w:pPr>
         <w:spacing w:after="30"/>
-      </w:pPr>
-      <w:r>
-        <w:rPr>
+        <w:rPr>
+          <w:rFonts w:asciiTheme="minorHAnsi" w:hAnsiTheme="minorHAnsi" w:cstheme="minorHAnsi"/>
+        </w:rPr>
+      </w:pPr>
+      <w:r>
+        <w:rPr>
+          <w:rFonts w:asciiTheme="minorHAnsi" w:hAnsiTheme="minorHAnsi" w:cstheme="minorHAnsi"/>
           <w:b/>
           <w:bCs/>
         </w:rPr>
         <w:t xml:space="preserve">Containers: </w:t>
       </w:r>
       <w:r>
+        <w:rPr>
+          <w:rFonts w:asciiTheme="minorHAnsi" w:hAnsiTheme="minorHAnsi" w:cstheme="minorHAnsi"/>
+        </w:rPr>
         <w:t>Docker</w:t>
       </w:r>
     </w:p>
     <w:p>
       <w:pPr>
         <w:spacing w:after="30"/>
-      </w:pPr>
-      <w:r>
-        <w:rPr>
+        <w:rPr>
+          <w:rFonts w:asciiTheme="minorHAnsi" w:hAnsiTheme="minorHAnsi" w:cstheme="minorHAnsi"/>
+        </w:rPr>
+      </w:pPr>
+      <w:r>
+        <w:rPr>
+          <w:rFonts w:asciiTheme="minorHAnsi" w:hAnsiTheme="minorHAnsi" w:cstheme="minorHAnsi"/>
           <w:b/>
           <w:bCs/>
         </w:rPr>
         <w:t xml:space="preserve">Cloud (AWS): </w:t>
       </w:r>
       <w:r>
+        <w:rPr>
+          <w:rFonts w:asciiTheme="minorHAnsi" w:hAnsiTheme="minorHAnsi" w:cstheme="minorHAnsi"/>
+        </w:rPr>
         <w:t>EC2, S3, IAM, Security Groups</w:t>
       </w:r>
     </w:p>
     <w:p>
       <w:pPr>
         <w:spacing w:after="30"/>
-      </w:pPr>
-      <w:r>
-        <w:rPr>
+        <w:rPr>
+          <w:rFonts w:asciiTheme="minorHAnsi" w:hAnsiTheme="minorHAnsi" w:cstheme="minorHAnsi"/>
+        </w:rPr>
+      </w:pPr>
+      <w:r>
+        <w:rPr>
+          <w:rFonts w:asciiTheme="minorHAnsi" w:hAnsiTheme="minorHAnsi" w:cstheme="minorHAnsi"/>
           <w:b/>
           <w:bCs/>
         </w:rPr>
@@ -233,6 +356,7 @@
       <w:proofErr w:type="spellStart"/>
       <w:r>
         <w:rPr>
+          <w:rFonts w:asciiTheme="minorHAnsi" w:hAnsiTheme="minorHAnsi" w:cstheme="minorHAnsi"/>
           <w:b/>
           <w:bCs/>
         </w:rPr>
@@ -241,94 +365,144 @@
       <w:proofErr w:type="spellEnd"/>
       <w:r>
         <w:rPr>
+          <w:rFonts w:asciiTheme="minorHAnsi" w:hAnsiTheme="minorHAnsi" w:cstheme="minorHAnsi"/>
           <w:b/>
           <w:bCs/>
         </w:rPr>
         <w:t xml:space="preserve">: </w:t>
       </w:r>
       <w:r>
+        <w:rPr>
+          <w:rFonts w:asciiTheme="minorHAnsi" w:hAnsiTheme="minorHAnsi" w:cstheme="minorHAnsi"/>
+        </w:rPr>
         <w:t xml:space="preserve">Nginx (reverse proxy, HTTPS termination), </w:t>
       </w:r>
       <w:r>
+        <w:rPr>
+          <w:rFonts w:asciiTheme="minorHAnsi" w:hAnsiTheme="minorHAnsi" w:cstheme="minorHAnsi"/>
+        </w:rPr>
         <w:t xml:space="preserve">Caddy, </w:t>
       </w:r>
       <w:r>
+        <w:rPr>
+          <w:rFonts w:asciiTheme="minorHAnsi" w:hAnsiTheme="minorHAnsi" w:cstheme="minorHAnsi"/>
+        </w:rPr>
         <w:t>PM2 (process lifecycle management)</w:t>
       </w:r>
     </w:p>
     <w:p>
       <w:pPr>
         <w:spacing w:after="30"/>
-      </w:pPr>
-      <w:r>
-        <w:rPr>
+        <w:rPr>
+          <w:rFonts w:asciiTheme="minorHAnsi" w:hAnsiTheme="minorHAnsi" w:cstheme="minorHAnsi"/>
+        </w:rPr>
+      </w:pPr>
+      <w:r>
+        <w:rPr>
+          <w:rFonts w:asciiTheme="minorHAnsi" w:hAnsiTheme="minorHAnsi" w:cstheme="minorHAnsi"/>
           <w:b/>
           <w:bCs/>
         </w:rPr>
         <w:t xml:space="preserve">Networking: </w:t>
       </w:r>
       <w:r>
+        <w:rPr>
+          <w:rFonts w:asciiTheme="minorHAnsi" w:hAnsiTheme="minorHAnsi" w:cstheme="minorHAnsi"/>
+        </w:rPr>
         <w:t xml:space="preserve">LAN configuration &amp; troubleshooting, </w:t>
       </w:r>
       <w:proofErr w:type="spellStart"/>
       <w:r>
+        <w:rPr>
+          <w:rFonts w:asciiTheme="minorHAnsi" w:hAnsiTheme="minorHAnsi" w:cstheme="minorHAnsi"/>
+        </w:rPr>
         <w:t>mDNS</w:t>
       </w:r>
       <w:proofErr w:type="spellEnd"/>
       <w:r>
+        <w:rPr>
+          <w:rFonts w:asciiTheme="minorHAnsi" w:hAnsiTheme="minorHAnsi" w:cstheme="minorHAnsi"/>
+        </w:rPr>
         <w:t>/hostname resolution, TCP/port management, HTTPS/TLS, DNS fundamentals</w:t>
       </w:r>
     </w:p>
     <w:p>
       <w:pPr>
         <w:spacing w:after="30"/>
-      </w:pPr>
-      <w:r>
-        <w:rPr>
+        <w:rPr>
+          <w:rFonts w:asciiTheme="minorHAnsi" w:hAnsiTheme="minorHAnsi" w:cstheme="minorHAnsi"/>
+        </w:rPr>
+      </w:pPr>
+      <w:r>
+        <w:rPr>
+          <w:rFonts w:asciiTheme="minorHAnsi" w:hAnsiTheme="minorHAnsi" w:cstheme="minorHAnsi"/>
           <w:b/>
           <w:bCs/>
         </w:rPr>
         <w:t xml:space="preserve">Monitoring &amp; Observability: </w:t>
       </w:r>
       <w:r>
+        <w:rPr>
+          <w:rFonts w:asciiTheme="minorHAnsi" w:hAnsiTheme="minorHAnsi" w:cstheme="minorHAnsi"/>
+        </w:rPr>
         <w:t xml:space="preserve">Prometheus, </w:t>
       </w:r>
       <w:proofErr w:type="spellStart"/>
       <w:r>
+        <w:rPr>
+          <w:rFonts w:asciiTheme="minorHAnsi" w:hAnsiTheme="minorHAnsi" w:cstheme="minorHAnsi"/>
+        </w:rPr>
         <w:t>OpenTelemetry</w:t>
       </w:r>
       <w:proofErr w:type="spellEnd"/>
       <w:r>
+        <w:rPr>
+          <w:rFonts w:asciiTheme="minorHAnsi" w:hAnsiTheme="minorHAnsi" w:cstheme="minorHAnsi"/>
+        </w:rPr>
         <w:t>, Pino (structured logging)</w:t>
       </w:r>
     </w:p>
     <w:p>
       <w:pPr>
         <w:spacing w:after="30"/>
-      </w:pPr>
-      <w:r>
-        <w:rPr>
+        <w:rPr>
+          <w:rFonts w:asciiTheme="minorHAnsi" w:hAnsiTheme="minorHAnsi" w:cstheme="minorHAnsi"/>
+        </w:rPr>
+      </w:pPr>
+      <w:r>
+        <w:rPr>
+          <w:rFonts w:asciiTheme="minorHAnsi" w:hAnsiTheme="minorHAnsi" w:cstheme="minorHAnsi"/>
           <w:b/>
           <w:bCs/>
         </w:rPr>
         <w:t xml:space="preserve">Databases: </w:t>
       </w:r>
       <w:r>
+        <w:rPr>
+          <w:rFonts w:asciiTheme="minorHAnsi" w:hAnsiTheme="minorHAnsi" w:cstheme="minorHAnsi"/>
+        </w:rPr>
         <w:t>MongoDB, PostgreSQL, Redis</w:t>
       </w:r>
     </w:p>
     <w:p>
       <w:pPr>
         <w:spacing w:after="30"/>
-      </w:pPr>
-      <w:r>
-        <w:rPr>
+        <w:rPr>
+          <w:rFonts w:asciiTheme="minorHAnsi" w:hAnsiTheme="minorHAnsi" w:cstheme="minorHAnsi"/>
+        </w:rPr>
+      </w:pPr>
+      <w:r>
+        <w:rPr>
+          <w:rFonts w:asciiTheme="minorHAnsi" w:hAnsiTheme="minorHAnsi" w:cstheme="minorHAnsi"/>
           <w:b/>
           <w:bCs/>
         </w:rPr>
         <w:t xml:space="preserve">Backend/Languages: </w:t>
       </w:r>
       <w:r>
+        <w:rPr>
+          <w:rFonts w:asciiTheme="minorHAnsi" w:hAnsiTheme="minorHAnsi" w:cstheme="minorHAnsi"/>
+        </w:rPr>
         <w:t>Node.js, Express.js, TypeScript, JavaScript, Java</w:t>
       </w:r>
     </w:p>
@@ -338,9 +512,13 @@
           <w:bottom w:val="single" w:sz="4" w:space="2" w:color="1F2937"/>
         </w:pBdr>
         <w:spacing w:before="90" w:after="40"/>
-      </w:pPr>
-      <w:r>
-        <w:rPr>
+        <w:rPr>
+          <w:rFonts w:asciiTheme="minorHAnsi" w:hAnsiTheme="minorHAnsi" w:cstheme="minorHAnsi"/>
+        </w:rPr>
+      </w:pPr>
+      <w:r>
+        <w:rPr>
+          <w:rFonts w:asciiTheme="minorHAnsi" w:hAnsiTheme="minorHAnsi" w:cstheme="minorHAnsi"/>
           <w:b/>
           <w:bCs/>
           <w:color w:val="1F2937"/>
@@ -355,23 +533,64 @@
           <w:tab w:val="right" w:pos="9360"/>
         </w:tabs>
         <w:spacing w:after="20"/>
-      </w:pPr>
-      <w:r>
-        <w:rPr>
+        <w:rPr>
+          <w:rFonts w:asciiTheme="minorHAnsi" w:hAnsiTheme="minorHAnsi" w:cstheme="minorHAnsi"/>
+        </w:rPr>
+      </w:pPr>
+      <w:r>
+        <w:rPr>
+          <w:rFonts w:asciiTheme="minorHAnsi" w:hAnsiTheme="minorHAnsi" w:cstheme="minorHAnsi"/>
           <w:b/>
           <w:bCs/>
           <w:sz w:val="21"/>
           <w:szCs w:val="21"/>
         </w:rPr>
-        <w:t>Software Engineer — Malavia Hospital, Surat, GJ</w:t>
-      </w:r>
-      <w:r>
-        <w:rPr>
+        <w:t xml:space="preserve">Software Engineer </w:t>
+      </w:r>
+      <w:r>
+        <w:rPr>
+          <w:rFonts w:asciiTheme="minorHAnsi" w:hAnsiTheme="minorHAnsi" w:cstheme="minorHAnsi"/>
+          <w:b/>
+          <w:bCs/>
+          <w:sz w:val="21"/>
+          <w:szCs w:val="21"/>
+        </w:rPr>
+        <w:t>-</w:t>
+      </w:r>
+      <w:r>
+        <w:rPr>
+          <w:rFonts w:asciiTheme="minorHAnsi" w:hAnsiTheme="minorHAnsi" w:cstheme="minorHAnsi"/>
+          <w:b/>
+          <w:bCs/>
+          <w:sz w:val="21"/>
+          <w:szCs w:val="21"/>
+        </w:rPr>
+        <w:t xml:space="preserve"> Malavia Hospital, Surat, GJ</w:t>
+      </w:r>
+      <w:r>
+        <w:rPr>
+          <w:rFonts w:asciiTheme="minorHAnsi" w:hAnsiTheme="minorHAnsi" w:cstheme="minorHAnsi"/>
           <w:i/>
           <w:iCs/>
         </w:rPr>
         <w:tab/>
-        <w:t>April 2024 – Present</w:t>
+        <w:t xml:space="preserve">April 2024 </w:t>
+      </w:r>
+      <w:r>
+        <w:rPr>
+          <w:rFonts w:asciiTheme="minorHAnsi" w:hAnsiTheme="minorHAnsi" w:cstheme="minorHAnsi"/>
+          <w:i/>
+          <w:iCs/>
+        </w:rPr>
+        <w:t>-</w:t>
+      </w:r>
+      <w:r>
+        <w:rPr>
+          <w:rFonts w:asciiTheme="minorHAnsi" w:hAnsiTheme="minorHAnsi" w:cstheme="minorHAnsi"/>
+          <w:i/>
+          <w:iCs/>
+        </w:rPr>
+        <w:t xml:space="preserve"> Present</w:t>
       </w:r>
     </w:p>
     <w:p>
@@ -382,8 +601,14 @@
           <w:numId w:val="1"/>
         </w:numPr>
         <w:spacing w:after="30"/>
-      </w:pPr>
-      <w:r>
+        <w:rPr>
+          <w:rFonts w:asciiTheme="minorHAnsi" w:hAnsiTheme="minorHAnsi" w:cstheme="minorHAnsi"/>
+        </w:rPr>
+      </w:pPr>
+      <w:r>
+        <w:rPr>
+          <w:rFonts w:asciiTheme="minorHAnsi" w:hAnsiTheme="minorHAnsi" w:cstheme="minorHAnsi"/>
+        </w:rPr>
         <w:t>Owned end-to-end deployment and infrastructure maintenance of a production healthcare claims platform used daily by hospital staff, on AWS EC2 with IAM-based access control and Security Groups for network-level restriction.</w:t>
       </w:r>
     </w:p>
@@ -395,9 +620,15 @@
           <w:numId w:val="1"/>
         </w:numPr>
         <w:spacing w:after="30"/>
-      </w:pPr>
-      <w:r>
-        <w:t>Configured and maintained Nginx as a reverse proxy and HTTPS termination layer; diagnosed and fixed a TLS module misconfiguration (http vs. https client) affecting health-check reliability.</w:t>
+        <w:rPr>
+          <w:rFonts w:asciiTheme="minorHAnsi" w:hAnsiTheme="minorHAnsi" w:cstheme="minorHAnsi"/>
+        </w:rPr>
+      </w:pPr>
+      <w:r>
+        <w:rPr>
+          <w:rFonts w:asciiTheme="minorHAnsi" w:hAnsiTheme="minorHAnsi" w:cstheme="minorHAnsi"/>
+        </w:rPr>
+        <w:t>Managed application process lifecycle in production using PM2, ensuring uptime and automatic recovery of Node.js services.</w:t>
       </w:r>
     </w:p>
     <w:p>
@@ -408,9 +639,15 @@
           <w:numId w:val="1"/>
         </w:numPr>
         <w:spacing w:after="30"/>
-      </w:pPr>
-      <w:r>
-        <w:t>Managed application process lifecycle in production using PM2, ensuring uptime and automatic recovery of Node.js services.</w:t>
+        <w:rPr>
+          <w:rFonts w:asciiTheme="minorHAnsi" w:hAnsiTheme="minorHAnsi" w:cstheme="minorHAnsi"/>
+        </w:rPr>
+      </w:pPr>
+      <w:r>
+        <w:rPr>
+          <w:rFonts w:asciiTheme="minorHAnsi" w:hAnsiTheme="minorHAnsi" w:cstheme="minorHAnsi"/>
+        </w:rPr>
+        <w:t>Built and maintained CI/CD pipelines using GitHub Actions to automate build and deployment workflows.</w:t>
       </w:r>
     </w:p>
     <w:p>
@@ -421,9 +658,21 @@
           <w:numId w:val="1"/>
         </w:numPr>
         <w:spacing w:after="30"/>
-      </w:pPr>
-      <w:r>
-        <w:t>Built and maintained CI/CD pipelines using GitHub Actions to automate build and deployment workflows.</w:t>
+        <w:rPr>
+          <w:rFonts w:asciiTheme="minorHAnsi" w:hAnsiTheme="minorHAnsi" w:cstheme="minorHAnsi"/>
+        </w:rPr>
+      </w:pPr>
+      <w:r>
+        <w:rPr>
+          <w:rFonts w:asciiTheme="minorHAnsi" w:hAnsiTheme="minorHAnsi" w:cstheme="minorHAnsi"/>
+        </w:rPr>
+        <w:t>Diagnosed and resolved infrastructure-level production issues, including Windows file-lock collisions on cache directories</w:t>
+      </w:r>
+      <w:r>
+        <w:rPr>
+          <w:rFonts w:asciiTheme="minorHAnsi" w:hAnsiTheme="minorHAnsi" w:cstheme="minorHAnsi"/>
+        </w:rPr>
+        <w:t xml:space="preserve"> during deployment.</w:t>
       </w:r>
     </w:p>
     <w:p>
@@ -434,17 +683,53 @@
           <w:numId w:val="1"/>
         </w:numPr>
         <w:spacing w:after="30"/>
-      </w:pPr>
-      <w:r>
-        <w:t xml:space="preserve">Diagnosed and resolved infrastructure-level production issues, including TCP TIME_WAIT port exhaustion, Windows file-lock collisions on cache directories, and LAN hostname resolution failures via </w:t>
+        <w:rPr>
+          <w:rFonts w:asciiTheme="minorHAnsi" w:hAnsiTheme="minorHAnsi" w:cstheme="minorHAnsi"/>
+        </w:rPr>
+      </w:pPr>
+      <w:r>
+        <w:rPr>
+          <w:rFonts w:asciiTheme="minorHAnsi" w:hAnsiTheme="minorHAnsi" w:cstheme="minorHAnsi"/>
+        </w:rPr>
+        <w:t xml:space="preserve">Implemented an observability stack </w:t>
+      </w:r>
+      <w:r>
+        <w:rPr>
+          <w:rFonts w:asciiTheme="minorHAnsi" w:hAnsiTheme="minorHAnsi" w:cstheme="minorHAnsi"/>
+        </w:rPr>
+        <w:t>-</w:t>
+      </w:r>
+      <w:r>
+        <w:rPr>
+          <w:rFonts w:asciiTheme="minorHAnsi" w:hAnsiTheme="minorHAnsi" w:cstheme="minorHAnsi"/>
+        </w:rPr>
+        <w:t xml:space="preserve"> Prometheus metrics, </w:t>
       </w:r>
       <w:proofErr w:type="spellStart"/>
       <w:r>
-        <w:t>mDNS</w:t>
+        <w:rPr>
+          <w:rFonts w:asciiTheme="minorHAnsi" w:hAnsiTheme="minorHAnsi" w:cstheme="minorHAnsi"/>
+        </w:rPr>
+        <w:t>OpenTelemetry</w:t>
       </w:r>
       <w:proofErr w:type="spellEnd"/>
       <w:r>
-        <w:t>/Bonjour.</w:t>
+        <w:rPr>
+          <w:rFonts w:asciiTheme="minorHAnsi" w:hAnsiTheme="minorHAnsi" w:cstheme="minorHAnsi"/>
+        </w:rPr>
+        <w:t xml:space="preserve"> tracing, and Pino structured logging </w:t>
+      </w:r>
+      <w:r>
+        <w:rPr>
+          <w:rFonts w:asciiTheme="minorHAnsi" w:hAnsiTheme="minorHAnsi" w:cstheme="minorHAnsi"/>
+        </w:rPr>
+        <w:t>-</w:t>
+      </w:r>
+      <w:r>
+        <w:rPr>
+          <w:rFonts w:asciiTheme="minorHAnsi" w:hAnsiTheme="minorHAnsi" w:cstheme="minorHAnsi"/>
+        </w:rPr>
+        <w:t xml:space="preserve"> to support production monitoring and debugging.</w:t>
       </w:r>
     </w:p>
     <w:p>
@@ -455,19 +740,29 @@
           <w:numId w:val="1"/>
         </w:numPr>
         <w:spacing w:after="30"/>
-      </w:pPr>
-      <w:r>
-        <w:t xml:space="preserve">Replaced hardcoded local IP configuration with a runtime-detected LAN IP approach (Node.js </w:t>
+        <w:rPr>
+          <w:rFonts w:asciiTheme="minorHAnsi" w:hAnsiTheme="minorHAnsi" w:cstheme="minorHAnsi"/>
+        </w:rPr>
+      </w:pPr>
+      <w:r>
+        <w:rPr>
+          <w:rFonts w:asciiTheme="minorHAnsi" w:hAnsiTheme="minorHAnsi" w:cstheme="minorHAnsi"/>
+        </w:rPr>
+        <w:t>Automated nightly backup jobs (node-</w:t>
       </w:r>
       <w:proofErr w:type="spellStart"/>
-      <w:proofErr w:type="gramStart"/>
-      <w:r>
-        <w:t>os.networkInterfaces</w:t>
+      <w:r>
+        <w:rPr>
+          <w:rFonts w:asciiTheme="minorHAnsi" w:hAnsiTheme="minorHAnsi" w:cstheme="minorHAnsi"/>
+        </w:rPr>
+        <w:t>cron</w:t>
       </w:r>
       <w:proofErr w:type="spellEnd"/>
-      <w:proofErr w:type="gramEnd"/>
-      <w:r>
-        <w:t>()), restoring reliable LAN client connectivity across the deployment.</w:t>
+      <w:r>
+        <w:rPr>
+          <w:rFonts w:asciiTheme="minorHAnsi" w:hAnsiTheme="minorHAnsi" w:cstheme="minorHAnsi"/>
+        </w:rPr>
+        <w:t xml:space="preserve"> scheduled tasks integrating with the Google Drive API via a service account) as part of routine infrastructure maintenance.</w:t>
       </w:r>
     </w:p>
     <w:p>
@@ -478,17 +773,36 @@
           <w:numId w:val="1"/>
         </w:numPr>
         <w:spacing w:after="30"/>
-      </w:pPr>
-      <w:r>
-        <w:t xml:space="preserve">Implemented an observability stack — Prometheus metrics, </w:t>
-      </w:r>
-      <w:proofErr w:type="spellStart"/>
-      <w:r>
-        <w:t>OpenTelemetry</w:t>
-      </w:r>
-      <w:proofErr w:type="spellEnd"/>
-      <w:r>
-        <w:t xml:space="preserve"> tracing, and Pino structured logging — to support production monitoring and debugging.</w:t>
+        <w:rPr>
+          <w:rFonts w:asciiTheme="minorHAnsi" w:hAnsiTheme="minorHAnsi" w:cstheme="minorHAnsi"/>
+        </w:rPr>
+      </w:pPr>
+      <w:r>
+        <w:rPr>
+          <w:rFonts w:asciiTheme="minorHAnsi" w:hAnsiTheme="minorHAnsi" w:cstheme="minorHAnsi"/>
+        </w:rPr>
+        <w:t>Wrote basic Bash scripts to support recurring deployment and maintenance tasks.</w:t>
+      </w:r>
+    </w:p>
+    <w:p>
+      <w:pPr>
+        <w:pBdr>
+          <w:bottom w:val="single" w:sz="4" w:space="2" w:color="1F2937"/>
+        </w:pBdr>
+        <w:spacing w:before="90" w:after="40"/>
+        <w:rPr>
+          <w:rFonts w:asciiTheme="minorHAnsi" w:hAnsiTheme="minorHAnsi" w:cstheme="minorHAnsi"/>
+        </w:rPr>
+      </w:pPr>
+      <w:r>
+        <w:rPr>
+          <w:rFonts w:asciiTheme="minorHAnsi" w:hAnsiTheme="minorHAnsi" w:cstheme="minorHAnsi"/>
+          <w:b/>
+          <w:bCs/>
+          <w:color w:val="1F2937"/>
+          <w:spacing w:val="20"/>
+        </w:rPr>
+        <w:t>ACHIEVEMENTS</w:t>
       </w:r>
     </w:p>
     <w:p>
@@ -499,17 +813,15 @@
           <w:numId w:val="1"/>
         </w:numPr>
         <w:spacing w:after="30"/>
-      </w:pPr>
-      <w:r>
-        <w:t>Automated nightly backup jobs (node-</w:t>
-      </w:r>
-      <w:proofErr w:type="spellStart"/>
-      <w:r>
-        <w:t>cron</w:t>
-      </w:r>
-      <w:proofErr w:type="spellEnd"/>
-      <w:r>
-        <w:t xml:space="preserve"> scheduled tasks integrating with the Google Drive API via a service account) as part of routine infrastructure maintenance.</w:t>
+        <w:rPr>
+          <w:rFonts w:asciiTheme="minorHAnsi" w:hAnsiTheme="minorHAnsi" w:cstheme="minorHAnsi"/>
+        </w:rPr>
+      </w:pPr>
+      <w:r>
+        <w:rPr>
+          <w:rFonts w:asciiTheme="minorHAnsi" w:hAnsiTheme="minorHAnsi" w:cstheme="minorHAnsi"/>
+        </w:rPr>
+        <w:t>Recovered EC2 instance access after an SSH firewall lockout, restoring administrative access without downtime.</w:t>
       </w:r>
     </w:p>
     <w:p>
@@ -520,51 +832,15 @@
           <w:numId w:val="1"/>
         </w:numPr>
         <w:spacing w:after="30"/>
-      </w:pPr>
-      <w:r>
-        <w:t>Wrote basic Bash scripts to support recurring deployment and maintenance tasks.</w:t>
-      </w:r>
-    </w:p>
-    <w:p>
-      <w:pPr>
-        <w:pBdr>
-          <w:bottom w:val="single" w:sz="4" w:space="2" w:color="1F2937"/>
-        </w:pBdr>
-        <w:spacing w:before="90" w:after="40"/>
-      </w:pPr>
-      <w:r>
-        <w:rPr>
-          <w:b/>
-          <w:bCs/>
-          <w:color w:val="1F2937"/>
-          <w:spacing w:val="20"/>
-        </w:rPr>
-        <w:t>PROJECTS</w:t>
-      </w:r>
-    </w:p>
-    <w:p>
-      <w:pPr>
-        <w:tabs>
-          <w:tab w:val="right" w:pos="9360"/>
-        </w:tabs>
-        <w:spacing w:after="20"/>
-      </w:pPr>
-      <w:r>
-        <w:rPr>
-          <w:b/>
-          <w:bCs/>
-          <w:sz w:val="21"/>
-          <w:szCs w:val="21"/>
-        </w:rPr>
-        <w:t>Horizon — Reverse Proxy &amp; Load Balancer (TypeScript, Node.js)</w:t>
-      </w:r>
-      <w:r>
-        <w:rPr>
-          <w:i/>
-          <w:iCs/>
-        </w:rPr>
-        <w:tab/>
-        <w:t>03/2026 – Present</w:t>
+        <w:rPr>
+          <w:rFonts w:asciiTheme="minorHAnsi" w:hAnsiTheme="minorHAnsi" w:cstheme="minorHAnsi"/>
+        </w:rPr>
+      </w:pPr>
+      <w:r>
+        <w:rPr>
+          <w:rFonts w:asciiTheme="minorHAnsi" w:hAnsiTheme="minorHAnsi" w:cstheme="minorHAnsi"/>
+        </w:rPr>
+        <w:t>Solved a production TLS/HTTPS and Nginx misconfiguration affecting health-check reliability.</w:t>
       </w:r>
     </w:p>
     <w:p>
@@ -575,78 +851,15 @@
           <w:numId w:val="1"/>
         </w:numPr>
         <w:spacing w:after="30"/>
-      </w:pPr>
-      <w:r>
-        <w:t xml:space="preserve">Built a reverse proxy/load balancer with round-robin routing, active health checks, automatic failover, and a monitoring endpoint exposing throughput, latency, and backend health. </w:t>
-      </w:r>
-      <w:r>
-        <w:rPr>
-          <w:color w:val="1D4ED8"/>
-          <w:sz w:val="19"/>
-          <w:szCs w:val="19"/>
-        </w:rPr>
-        <w:t>github.com/</w:t>
-      </w:r>
-      <w:proofErr w:type="spellStart"/>
-      <w:r>
-        <w:rPr>
-          <w:color w:val="1D4ED8"/>
-          <w:sz w:val="19"/>
-          <w:szCs w:val="19"/>
-        </w:rPr>
-        <w:t>rohitbytecode</w:t>
-      </w:r>
-      <w:proofErr w:type="spellEnd"/>
-      <w:r>
-        <w:rPr>
-          <w:color w:val="1D4ED8"/>
-          <w:sz w:val="19"/>
-          <w:szCs w:val="19"/>
-        </w:rPr>
-        <w:t>/Horizon</w:t>
-      </w:r>
-    </w:p>
-    <w:p>
-      <w:pPr>
-        <w:tabs>
-          <w:tab w:val="right" w:pos="9360"/>
-        </w:tabs>
-        <w:spacing w:after="20"/>
-      </w:pPr>
-      <w:r>
-        <w:rPr>
-          <w:b/>
-          <w:bCs/>
-          <w:sz w:val="21"/>
-          <w:szCs w:val="21"/>
-        </w:rPr>
-        <w:t>Hospital Management SaaS — Backend Deployment (</w:t>
-      </w:r>
-      <w:r>
-        <w:rPr>
-          <w:b/>
-          <w:bCs/>
-          <w:sz w:val="21"/>
-          <w:szCs w:val="21"/>
-        </w:rPr>
-        <w:t>Java</w:t>
-      </w:r>
-      <w:r>
-        <w:rPr>
-          <w:b/>
-          <w:bCs/>
-          <w:sz w:val="21"/>
-          <w:szCs w:val="21"/>
-        </w:rPr>
-        <w:t>Script, Node.js, MongoDB)</w:t>
-      </w:r>
-      <w:r>
-        <w:rPr>
-          <w:i/>
-          <w:iCs/>
-        </w:rPr>
-        <w:tab/>
-        <w:t>12/2025 – 03/2026</w:t>
+        <w:rPr>
+          <w:rFonts w:asciiTheme="minorHAnsi" w:hAnsiTheme="minorHAnsi" w:cstheme="minorHAnsi"/>
+        </w:rPr>
+      </w:pPr>
+      <w:r>
+        <w:rPr>
+          <w:rFonts w:asciiTheme="minorHAnsi" w:hAnsiTheme="minorHAnsi" w:cstheme="minorHAnsi"/>
+        </w:rPr>
+        <w:t>Diagnosed and resolved a TCP TIME_WAIT socket exhaustion issue in production.</w:t>
       </w:r>
     </w:p>
     <w:p>
@@ -657,35 +870,31 @@
           <w:numId w:val="1"/>
         </w:numPr>
         <w:spacing w:after="30"/>
-      </w:pPr>
-      <w:r>
-        <w:t xml:space="preserve">Developed backend services for a multi-tenant SaaS with retry logic, error handling, and structured logging for fault-tolerant operation. </w:t>
-      </w:r>
-      <w:r>
-        <w:rPr>
-          <w:color w:val="1D4ED8"/>
-          <w:sz w:val="19"/>
-          <w:szCs w:val="19"/>
-        </w:rPr>
-        <w:t>github.com/</w:t>
+        <w:rPr>
+          <w:rFonts w:asciiTheme="minorHAnsi" w:hAnsiTheme="minorHAnsi" w:cstheme="minorHAnsi"/>
+        </w:rPr>
+      </w:pPr>
+      <w:r>
+        <w:rPr>
+          <w:rFonts w:asciiTheme="minorHAnsi" w:hAnsiTheme="minorHAnsi" w:cstheme="minorHAnsi"/>
+        </w:rPr>
+        <w:t>Fixed LAN hostname resolution failures using a runtime IP discovery approach (</w:t>
       </w:r>
       <w:proofErr w:type="spellStart"/>
-      <w:r>
-        <w:rPr>
-          <w:color w:val="1D4ED8"/>
-          <w:sz w:val="19"/>
-          <w:szCs w:val="19"/>
-        </w:rPr>
-        <w:t>rohitbytecode</w:t>
+      <w:proofErr w:type="gramStart"/>
+      <w:r>
+        <w:rPr>
+          <w:rFonts w:asciiTheme="minorHAnsi" w:hAnsiTheme="minorHAnsi" w:cstheme="minorHAnsi"/>
+        </w:rPr>
+        <w:t>os.networkInterfaces</w:t>
       </w:r>
       <w:proofErr w:type="spellEnd"/>
-      <w:r>
-        <w:rPr>
-          <w:color w:val="1D4ED8"/>
-          <w:sz w:val="19"/>
-          <w:szCs w:val="19"/>
-        </w:rPr>
-        <w:t>/HMS-SaaS</w:t>
+      <w:proofErr w:type="gramEnd"/>
+      <w:r>
+        <w:rPr>
+          <w:rFonts w:asciiTheme="minorHAnsi" w:hAnsiTheme="minorHAnsi" w:cstheme="minorHAnsi"/>
+        </w:rPr>
+        <w:t xml:space="preserve">()). </w:t>
       </w:r>
     </w:p>
     <w:p>
@@ -694,23 +903,312 @@
           <w:bottom w:val="single" w:sz="4" w:space="2" w:color="1F2937"/>
         </w:pBdr>
         <w:spacing w:before="90" w:after="40"/>
-      </w:pPr>
-      <w:r>
-        <w:rPr>
+        <w:rPr>
+          <w:rFonts w:asciiTheme="minorHAnsi" w:hAnsiTheme="minorHAnsi" w:cstheme="minorHAnsi"/>
+        </w:rPr>
+      </w:pPr>
+      <w:r>
+        <w:rPr>
+          <w:rFonts w:asciiTheme="minorHAnsi" w:hAnsiTheme="minorHAnsi" w:cstheme="minorHAnsi"/>
           <w:b/>
           <w:bCs/>
           <w:color w:val="1F2937"/>
           <w:spacing w:val="20"/>
         </w:rPr>
+        <w:t xml:space="preserve">OPEN-SOURCE </w:t>
+      </w:r>
+      <w:r>
+        <w:rPr>
+          <w:rFonts w:asciiTheme="minorHAnsi" w:hAnsiTheme="minorHAnsi" w:cstheme="minorHAnsi"/>
+          <w:b/>
+          <w:bCs/>
+          <w:color w:val="1F2937"/>
+          <w:spacing w:val="20"/>
+        </w:rPr>
+        <w:t>PROJECTS</w:t>
+      </w:r>
+    </w:p>
+    <w:p>
+      <w:pPr>
+        <w:tabs>
+          <w:tab w:val="right" w:pos="9360"/>
+        </w:tabs>
+        <w:spacing w:after="20"/>
+        <w:rPr>
+          <w:rFonts w:asciiTheme="minorHAnsi" w:hAnsiTheme="minorHAnsi" w:cstheme="minorHAnsi"/>
+        </w:rPr>
+      </w:pPr>
+      <w:r>
+        <w:rPr>
+          <w:rFonts w:asciiTheme="minorHAnsi" w:hAnsiTheme="minorHAnsi" w:cstheme="minorHAnsi"/>
+          <w:b/>
+          <w:bCs/>
+          <w:sz w:val="21"/>
+          <w:szCs w:val="21"/>
+        </w:rPr>
+        <w:t xml:space="preserve">Horizon </w:t>
+      </w:r>
+      <w:r>
+        <w:rPr>
+          <w:rFonts w:asciiTheme="minorHAnsi" w:hAnsiTheme="minorHAnsi" w:cstheme="minorHAnsi"/>
+          <w:b/>
+          <w:bCs/>
+          <w:sz w:val="21"/>
+          <w:szCs w:val="21"/>
+        </w:rPr>
+        <w:t>-</w:t>
+      </w:r>
+      <w:r>
+        <w:rPr>
+          <w:rFonts w:asciiTheme="minorHAnsi" w:hAnsiTheme="minorHAnsi" w:cstheme="minorHAnsi"/>
+          <w:b/>
+          <w:bCs/>
+          <w:sz w:val="21"/>
+          <w:szCs w:val="21"/>
+        </w:rPr>
+        <w:t xml:space="preserve"> Reverse Proxy &amp; Load Balancer (TypeScript, Node.js)</w:t>
+      </w:r>
+      <w:r>
+        <w:rPr>
+          <w:rFonts w:asciiTheme="minorHAnsi" w:hAnsiTheme="minorHAnsi" w:cstheme="minorHAnsi"/>
+          <w:i/>
+          <w:iCs/>
+        </w:rPr>
+        <w:tab/>
+        <w:t xml:space="preserve">03/2026 </w:t>
+      </w:r>
+      <w:r>
+        <w:rPr>
+          <w:rFonts w:asciiTheme="minorHAnsi" w:hAnsiTheme="minorHAnsi" w:cstheme="minorHAnsi"/>
+          <w:i/>
+          <w:iCs/>
+        </w:rPr>
+        <w:t>-</w:t>
+      </w:r>
+      <w:r>
+        <w:rPr>
+          <w:rFonts w:asciiTheme="minorHAnsi" w:hAnsiTheme="minorHAnsi" w:cstheme="minorHAnsi"/>
+          <w:i/>
+          <w:iCs/>
+        </w:rPr>
+        <w:t xml:space="preserve"> Present</w:t>
+      </w:r>
+    </w:p>
+    <w:p>
+      <w:pPr>
+        <w:pStyle w:val="ListParagraph"/>
+        <w:numPr>
+          <w:ilvl w:val="0"/>
+          <w:numId w:val="1"/>
+        </w:numPr>
+        <w:spacing w:after="30"/>
+        <w:rPr>
+          <w:rFonts w:asciiTheme="minorHAnsi" w:hAnsiTheme="minorHAnsi" w:cstheme="minorHAnsi"/>
+        </w:rPr>
+      </w:pPr>
+      <w:r>
+        <w:rPr>
+          <w:rFonts w:asciiTheme="minorHAnsi" w:hAnsiTheme="minorHAnsi" w:cstheme="minorHAnsi"/>
+        </w:rPr>
+        <w:t xml:space="preserve">Built a reverse proxy/load balancer with round-robin routing, active health checks, automatic failover, and a monitoring endpoint exposing throughput, latency, and backend health. </w:t>
+      </w:r>
+      <w:hyperlink r:id="rId8" w:history="1">
+        <w:r>
+          <w:rPr>
+            <w:rStyle w:val="Hyperlink"/>
+            <w:rFonts w:asciiTheme="minorHAnsi" w:hAnsiTheme="minorHAnsi" w:cstheme="minorHAnsi"/>
+            <w:sz w:val="19"/>
+            <w:szCs w:val="19"/>
+          </w:rPr>
+          <w:t>github.com/</w:t>
+        </w:r>
+        <w:proofErr w:type="spellStart"/>
+        <w:r>
+          <w:rPr>
+            <w:rStyle w:val="Hyperlink"/>
+            <w:rFonts w:asciiTheme="minorHAnsi" w:hAnsiTheme="minorHAnsi" w:cstheme="minorHAnsi"/>
+            <w:sz w:val="19"/>
+            <w:szCs w:val="19"/>
+          </w:rPr>
+          <w:t>r</w:t>
+        </w:r>
+        <w:r>
+          <w:rPr>
+            <w:rStyle w:val="Hyperlink"/>
+            <w:rFonts w:asciiTheme="minorHAnsi" w:hAnsiTheme="minorHAnsi" w:cstheme="minorHAnsi"/>
+            <w:sz w:val="19"/>
+            <w:szCs w:val="19"/>
+          </w:rPr>
+          <w:t>ohitbytecode</w:t>
+        </w:r>
+        <w:proofErr w:type="spellEnd"/>
+        <w:r>
+          <w:rPr>
+            <w:rStyle w:val="Hyperlink"/>
+            <w:rFonts w:asciiTheme="minorHAnsi" w:hAnsiTheme="minorHAnsi" w:cstheme="minorHAnsi"/>
+            <w:sz w:val="19"/>
+            <w:szCs w:val="19"/>
+          </w:rPr>
+          <w:t>/Horizon</w:t>
+        </w:r>
+      </w:hyperlink>
+    </w:p>
+    <w:p>
+      <w:pPr>
+        <w:tabs>
+          <w:tab w:val="right" w:pos="9360"/>
+        </w:tabs>
+        <w:spacing w:after="20"/>
+        <w:rPr>
+          <w:rFonts w:asciiTheme="minorHAnsi" w:hAnsiTheme="minorHAnsi" w:cstheme="minorHAnsi"/>
+        </w:rPr>
+      </w:pPr>
+      <w:r>
+        <w:rPr>
+          <w:rFonts w:asciiTheme="minorHAnsi" w:hAnsiTheme="minorHAnsi" w:cstheme="minorHAnsi"/>
+          <w:b/>
+          <w:bCs/>
+          <w:sz w:val="21"/>
+          <w:szCs w:val="21"/>
+        </w:rPr>
+        <w:t>Hospital Management SaaS — Backend Deployment (</w:t>
+      </w:r>
+      <w:r>
+        <w:rPr>
+          <w:rFonts w:asciiTheme="minorHAnsi" w:hAnsiTheme="minorHAnsi" w:cstheme="minorHAnsi"/>
+          <w:b/>
+          <w:bCs/>
+          <w:sz w:val="21"/>
+          <w:szCs w:val="21"/>
+        </w:rPr>
+        <w:t>Java</w:t>
+      </w:r>
+      <w:r>
+        <w:rPr>
+          <w:rFonts w:asciiTheme="minorHAnsi" w:hAnsiTheme="minorHAnsi" w:cstheme="minorHAnsi"/>
+          <w:b/>
+          <w:bCs/>
+          <w:sz w:val="21"/>
+          <w:szCs w:val="21"/>
+        </w:rPr>
+        <w:t>Script, Node.js, MongoDB)</w:t>
+      </w:r>
+      <w:r>
+        <w:rPr>
+          <w:rFonts w:asciiTheme="minorHAnsi" w:hAnsiTheme="minorHAnsi" w:cstheme="minorHAnsi"/>
+          <w:i/>
+          <w:iCs/>
+        </w:rPr>
+        <w:tab/>
+        <w:t xml:space="preserve">12/2025 </w:t>
+      </w:r>
+      <w:r>
+        <w:rPr>
+          <w:rFonts w:asciiTheme="minorHAnsi" w:hAnsiTheme="minorHAnsi" w:cstheme="minorHAnsi"/>
+          <w:i/>
+          <w:iCs/>
+        </w:rPr>
+        <w:t>-</w:t>
+      </w:r>
+      <w:r>
+        <w:rPr>
+          <w:rFonts w:asciiTheme="minorHAnsi" w:hAnsiTheme="minorHAnsi" w:cstheme="minorHAnsi"/>
+          <w:i/>
+          <w:iCs/>
+        </w:rPr>
+        <w:t xml:space="preserve"> 03/2026</w:t>
+      </w:r>
+    </w:p>
+    <w:p>
+      <w:pPr>
+        <w:pStyle w:val="ListParagraph"/>
+        <w:numPr>
+          <w:ilvl w:val="0"/>
+          <w:numId w:val="1"/>
+        </w:numPr>
+        <w:spacing w:after="30"/>
+        <w:rPr>
+          <w:rFonts w:asciiTheme="minorHAnsi" w:hAnsiTheme="minorHAnsi" w:cstheme="minorHAnsi"/>
+        </w:rPr>
+      </w:pPr>
+      <w:r>
+        <w:rPr>
+          <w:rFonts w:asciiTheme="minorHAnsi" w:hAnsiTheme="minorHAnsi" w:cstheme="minorHAnsi"/>
+        </w:rPr>
+        <w:t xml:space="preserve">Developed backend services for a multi-tenant SaaS with retry logic, error handling, and structured logging for fault-tolerant operation. </w:t>
+      </w:r>
+      <w:hyperlink r:id="rId9" w:history="1">
+        <w:r>
+          <w:rPr>
+            <w:rStyle w:val="Hyperlink"/>
+            <w:rFonts w:asciiTheme="minorHAnsi" w:hAnsiTheme="minorHAnsi" w:cstheme="minorHAnsi"/>
+            <w:sz w:val="19"/>
+            <w:szCs w:val="19"/>
+          </w:rPr>
+          <w:t>github.com/</w:t>
+        </w:r>
+        <w:proofErr w:type="spellStart"/>
+        <w:r>
+          <w:rPr>
+            <w:rStyle w:val="Hyperlink"/>
+            <w:rFonts w:asciiTheme="minorHAnsi" w:hAnsiTheme="minorHAnsi" w:cstheme="minorHAnsi"/>
+            <w:sz w:val="19"/>
+            <w:szCs w:val="19"/>
+          </w:rPr>
+          <w:t>rohitbytecod</w:t>
+        </w:r>
+        <w:r>
+          <w:rPr>
+            <w:rStyle w:val="Hyperlink"/>
+            <w:rFonts w:asciiTheme="minorHAnsi" w:hAnsiTheme="minorHAnsi" w:cstheme="minorHAnsi"/>
+            <w:sz w:val="19"/>
+            <w:szCs w:val="19"/>
+          </w:rPr>
+          <w:t>e</w:t>
+        </w:r>
+        <w:proofErr w:type="spellEnd"/>
+        <w:r>
+          <w:rPr>
+            <w:rStyle w:val="Hyperlink"/>
+            <w:rFonts w:asciiTheme="minorHAnsi" w:hAnsiTheme="minorHAnsi" w:cstheme="minorHAnsi"/>
+            <w:sz w:val="19"/>
+            <w:szCs w:val="19"/>
+          </w:rPr>
+          <w:t>/HMS-SaaS</w:t>
+        </w:r>
+      </w:hyperlink>
+    </w:p>
+    <w:p>
+      <w:pPr>
+        <w:pBdr>
+          <w:bottom w:val="single" w:sz="4" w:space="2" w:color="1F2937"/>
+        </w:pBdr>
+        <w:spacing w:before="90" w:after="40"/>
+        <w:rPr>
+          <w:rFonts w:asciiTheme="minorHAnsi" w:hAnsiTheme="minorHAnsi" w:cstheme="minorHAnsi"/>
+        </w:rPr>
+      </w:pPr>
+      <w:r>
+        <w:rPr>
+          <w:rFonts w:asciiTheme="minorHAnsi" w:hAnsiTheme="minorHAnsi" w:cstheme="minorHAnsi"/>
+          <w:b/>
+          <w:bCs/>
+          <w:color w:val="1F2937"/>
+          <w:spacing w:val="20"/>
+        </w:rPr>
         <w:t>ADDITIONAL TECHNICAL EXPOSURE (SELF-DIRECTED / LAB PROJECTS)</w:t>
       </w:r>
     </w:p>
     <w:p>
       <w:pPr>
         <w:spacing w:after="80"/>
-      </w:pPr>
-      <w:r>
-        <w:rPr>
+        <w:rPr>
+          <w:rFonts w:asciiTheme="minorHAnsi" w:hAnsiTheme="minorHAnsi" w:cstheme="minorHAnsi"/>
+        </w:rPr>
+      </w:pPr>
+      <w:r>
+        <w:rPr>
+          <w:rFonts w:asciiTheme="minorHAnsi" w:hAnsiTheme="minorHAnsi" w:cstheme="minorHAnsi"/>
           <w:i/>
           <w:iCs/>
           <w:color w:val="555555"/>
@@ -721,6 +1219,7 @@
       </w:r>
       <w:r>
         <w:rPr>
+          <w:rFonts w:asciiTheme="minorHAnsi" w:hAnsiTheme="minorHAnsi" w:cstheme="minorHAnsi"/>
           <w:i/>
           <w:iCs/>
           <w:color w:val="555555"/>
@@ -738,8 +1237,14 @@
           <w:numId w:val="1"/>
         </w:numPr>
         <w:spacing w:after="30"/>
-      </w:pPr>
-      <w:r>
+        <w:rPr>
+          <w:rFonts w:asciiTheme="minorHAnsi" w:hAnsiTheme="minorHAnsi" w:cstheme="minorHAnsi"/>
+        </w:rPr>
+      </w:pPr>
+      <w:r>
+        <w:rPr>
+          <w:rFonts w:asciiTheme="minorHAnsi" w:hAnsiTheme="minorHAnsi" w:cstheme="minorHAnsi"/>
+        </w:rPr>
         <w:t>Kubernetes: deployed and managed pods, services, and deployments in a personal lab/learning environment (not yet in production).</w:t>
       </w:r>
     </w:p>
@@ -751,8 +1256,14 @@
           <w:numId w:val="1"/>
         </w:numPr>
         <w:spacing w:after="30"/>
-      </w:pPr>
-      <w:r>
+        <w:rPr>
+          <w:rFonts w:asciiTheme="minorHAnsi" w:hAnsiTheme="minorHAnsi" w:cstheme="minorHAnsi"/>
+        </w:rPr>
+      </w:pPr>
+      <w:r>
+        <w:rPr>
+          <w:rFonts w:asciiTheme="minorHAnsi" w:hAnsiTheme="minorHAnsi" w:cstheme="minorHAnsi"/>
+        </w:rPr>
         <w:t>Jenkins: built and ran CI pipelines in personal projects.</w:t>
       </w:r>
     </w:p>
@@ -764,8 +1275,14 @@
           <w:numId w:val="1"/>
         </w:numPr>
         <w:spacing w:after="30"/>
-      </w:pPr>
-      <w:r>
+        <w:rPr>
+          <w:rFonts w:asciiTheme="minorHAnsi" w:hAnsiTheme="minorHAnsi" w:cstheme="minorHAnsi"/>
+        </w:rPr>
+      </w:pPr>
+      <w:r>
+        <w:rPr>
+          <w:rFonts w:asciiTheme="minorHAnsi" w:hAnsiTheme="minorHAnsi" w:cstheme="minorHAnsi"/>
+        </w:rPr>
         <w:t>GitLab CI/CD: configured pipeline stages for personal repositories.</w:t>
       </w:r>
     </w:p>
@@ -777,8 +1294,14 @@
           <w:numId w:val="1"/>
         </w:numPr>
         <w:spacing w:after="30"/>
-      </w:pPr>
-      <w:r>
+        <w:rPr>
+          <w:rFonts w:asciiTheme="minorHAnsi" w:hAnsiTheme="minorHAnsi" w:cstheme="minorHAnsi"/>
+        </w:rPr>
+      </w:pPr>
+      <w:r>
+        <w:rPr>
+          <w:rFonts w:asciiTheme="minorHAnsi" w:hAnsiTheme="minorHAnsi" w:cstheme="minorHAnsi"/>
+        </w:rPr>
         <w:t>Terraform: wrote basic infrastructure-as-code configurations for personal projects.</w:t>
       </w:r>
     </w:p>
@@ -788,9 +1311,13 @@
           <w:bottom w:val="single" w:sz="4" w:space="2" w:color="1F2937"/>
         </w:pBdr>
         <w:spacing w:before="90" w:after="40"/>
-      </w:pPr>
-      <w:r>
-        <w:rPr>
+        <w:rPr>
+          <w:rFonts w:asciiTheme="minorHAnsi" w:hAnsiTheme="minorHAnsi" w:cstheme="minorHAnsi"/>
+        </w:rPr>
+      </w:pPr>
+      <w:r>
+        <w:rPr>
+          <w:rFonts w:asciiTheme="minorHAnsi" w:hAnsiTheme="minorHAnsi" w:cstheme="minorHAnsi"/>
           <w:b/>
           <w:bCs/>
           <w:color w:val="1F2937"/>
@@ -805,27 +1332,100 @@
           <w:tab w:val="right" w:pos="9360"/>
         </w:tabs>
         <w:spacing w:after="20"/>
-      </w:pPr>
-      <w:r>
-        <w:t>Bachelor of Computer Application (BCA) — Vivekanand College for Advanced Computer &amp; Information Science, Surat, GJ</w:t>
-      </w:r>
-      <w:r>
-        <w:rPr>
+        <w:rPr>
+          <w:rFonts w:asciiTheme="minorHAnsi" w:hAnsiTheme="minorHAnsi" w:cstheme="minorHAnsi"/>
+        </w:rPr>
+      </w:pPr>
+      <w:r>
+        <w:rPr>
+          <w:rFonts w:asciiTheme="minorHAnsi" w:hAnsiTheme="minorHAnsi" w:cstheme="minorHAnsi"/>
+        </w:rPr>
+        <w:t xml:space="preserve">Bachelor of Computer Application (BCA) </w:t>
+      </w:r>
+      <w:r>
+        <w:rPr>
+          <w:rFonts w:asciiTheme="minorHAnsi" w:hAnsiTheme="minorHAnsi" w:cstheme="minorHAnsi"/>
+        </w:rPr>
+        <w:t>-</w:t>
+      </w:r>
+      <w:r>
+        <w:rPr>
+          <w:rFonts w:asciiTheme="minorHAnsi" w:hAnsiTheme="minorHAnsi" w:cstheme="minorHAnsi"/>
+        </w:rPr>
+        <w:t xml:space="preserve"> Vivekanand College for Advanced Computer &amp; Information Science, Surat, GJ</w:t>
+      </w:r>
+      <w:r>
+        <w:rPr>
+          <w:rFonts w:asciiTheme="minorHAnsi" w:hAnsiTheme="minorHAnsi" w:cstheme="minorHAnsi"/>
           <w:i/>
           <w:iCs/>
         </w:rPr>
         <w:tab/>
-        <w:t>2023 – 2026</w:t>
+        <w:t xml:space="preserve">2023 </w:t>
+      </w:r>
+      <w:r>
+        <w:rPr>
+          <w:rFonts w:asciiTheme="minorHAnsi" w:hAnsiTheme="minorHAnsi" w:cstheme="minorHAnsi"/>
+          <w:i/>
+          <w:iCs/>
+        </w:rPr>
+        <w:t>-</w:t>
+      </w:r>
+      <w:r>
+        <w:rPr>
+          <w:rFonts w:asciiTheme="minorHAnsi" w:hAnsiTheme="minorHAnsi" w:cstheme="minorHAnsi"/>
+          <w:i/>
+          <w:iCs/>
+        </w:rPr>
+        <w:t xml:space="preserve"> 2026</w:t>
       </w:r>
     </w:p>
     <w:sectPr>
       <w:pgSz w:w="11906" w:h="16838"/>
-      <w:pgMar w:top="320" w:right="560" w:bottom="320" w:left="560" w:header="708" w:footer="708" w:gutter="0"/>
+      <w:pgMar w:top="144" w:right="562" w:bottom="0" w:left="562" w:header="706" w:footer="706" w:gutter="0"/>
       <w:cols w:space="720"/>
       <w:docGrid w:linePitch="360"/>
     </w:sectPr>
   </w:body>
 </w:document>
+</file>
+
+<file path=word/endnotes.xml><?xml version="1.0" encoding="utf-8"?>
+<w:endnotes xmlns:wpc="http://schemas.microsoft.com/office/word/2010/wordprocessingCanvas" xmlns:cx="http://schemas.microsoft.com/office/drawing/2014/chartex" xmlns:cx1="http://schemas.microsoft.com/office/drawing/2015/9/8/chartex" xmlns:cx2="http://schemas.microsoft.com/office/drawing/2015/10/21/chartex" xmlns:cx3="http://schemas.microsoft.com/office/drawing/2016/5/9/chartex" xmlns:cx4="http://schemas.microsoft.com/office/drawing/2016/5/10/chartex" xmlns:cx5="http://schemas.microsoft.com/office/drawing/2016/5/11/chartex" xmlns:cx6="http://schemas.microsoft.com/office/drawing/2016/5/12/chartex" xmlns:cx7="http://schemas.microsoft.com/office/drawing/2016/5/13/chartex" xmlns:cx8="http://schemas.microsoft.com/office/drawing/2016/5/14/chartex" xmlns:mc="http://schemas.openxmlformats.org/markup-compatibility/2006" xmlns:aink="http://schemas.microsoft.com/office/drawing/2016/ink" xmlns:am3d="http://schemas.microsoft.com/office/drawing/2017/model3d" xmlns:o="urn:schemas-microsoft-com:office:office" xmlns:oel="http://schemas.microsoft.com/office/2019/extlst" xmlns:r="http://schemas.openxmlformats.org/officeDocument/2006/relationships" xmlns:m="http://schemas.openxmlformats.org/officeDocument/2006/math" xmlns:v="urn:schemas-microsoft-com:vml" xmlns:wp14="http://schemas.microsoft.com/office/word/2010/wordprocessingDrawing" xmlns:wp="http://schemas.openxmlformats.org/drawingml/2006/wordprocessingDrawing" xmlns:w10="urn:schemas-microsoft-com:office:word" xmlns:w="http://schemas.openxmlformats.org/wordprocessingml/2006/main" xmlns:w14="http://schemas.microsoft.com/office/word/2010/wordml" xmlns:w15="http://schemas.microsoft.com/office/word/2012/wordml" xmlns:w16cex="http://schemas.microsoft.com/office/word/2018/wordml/cex" xmlns:w16cid="http://schemas.microsoft.com/office/word/2016/wordml/cid" xmlns:w16="http://schemas.microsoft.com/office/word/2018/wordml" xmlns:w16du="http://schemas.microsoft.com/office/word/2023/wordml/word16du" xmlns:w16sdtdh="http://schemas.microsoft.com/office/word/2020/wordml/sdtdatahash" xmlns:w16sdtfl="http://schemas.microsoft.com/office/word/2024/wordml/sdtformatlock" xmlns:w16se="http://schemas.microsoft.com/office/word/2015/wordml/symex" xmlns:wpg="http://schemas.microsoft.com/office/word/2010/wordprocessingGroup" xmlns:wpi="http://schemas.microsoft.com/office/word/2010/wordprocessingInk" xmlns:wne="http://schemas.microsoft.com/office/word/2006/wordml" xmlns:wps="http://schemas.microsoft.com/office/word/2010/wordprocessingShape" mc:Ignorable="w14 w15 w16se w16cid w16 w16cex w16sdtdh w16sdtfl w16du wp14">
+  <w:endnote w:type="separator" w:id="-1">
+    <w:p>
+      <w:r>
+        <w:separator/>
+      </w:r>
+    </w:p>
+  </w:endnote>
+  <w:endnote w:type="continuationSeparator" w:id="0">
+    <w:p>
+      <w:r>
+        <w:continuationSeparator/>
+      </w:r>
+    </w:p>
+  </w:endnote>
+</w:endnotes>
+</file>
+
+<file path=word/footnotes.xml><?xml version="1.0" encoding="utf-8"?>
+<w:footnotes xmlns:wpc="http://schemas.microsoft.com/office/word/2010/wordprocessingCanvas" xmlns:cx="http://schemas.microsoft.com/office/drawing/2014/chartex" xmlns:cx1="http://schemas.microsoft.com/office/drawing/2015/9/8/chartex" xmlns:cx2="http://schemas.microsoft.com/office/drawing/2015/10/21/chartex" xmlns:cx3="http://schemas.microsoft.com/office/drawing/2016/5/9/chartex" xmlns:cx4="http://schemas.microsoft.com/office/drawing/2016/5/10/chartex" xmlns:cx5="http://schemas.microsoft.com/office/drawing/2016/5/11/chartex" xmlns:cx6="http://schemas.microsoft.com/office/drawing/2016/5/12/chartex" xmlns:cx7="http://schemas.microsoft.com/office/drawing/2016/5/13/chartex" xmlns:cx8="http://schemas.microsoft.com/office/drawing/2016/5/14/chartex" xmlns:mc="http://schemas.openxmlformats.org/markup-compatibility/2006" xmlns:aink="http://schemas.microsoft.com/office/drawing/2016/ink" xmlns:am3d="http://schemas.microsoft.com/office/drawing/2017/model3d" xmlns:o="urn:schemas-microsoft-com:office:office" xmlns:oel="http://schemas.microsoft.com/office/2019/extlst" xmlns:r="http://schemas.openxmlformats.org/officeDocument/2006/relationships" xmlns:m="http://schemas.openxmlformats.org/officeDocument/2006/math" xmlns:v="urn:schemas-microsoft-com:vml" xmlns:wp14="http://schemas.microsoft.com/office/word/2010/wordprocessingDrawing" xmlns:wp="http://schemas.openxmlformats.org/drawingml/2006/wordprocessingDrawing" xmlns:w10="urn:schemas-microsoft-com:office:word" xmlns:w="http://schemas.openxmlformats.org/wordprocessingml/2006/main" xmlns:w14="http://schemas.microsoft.com/office/word/2010/wordml" xmlns:w15="http://schemas.microsoft.com/office/word/2012/wordml" xmlns:w16cex="http://schemas.microsoft.com/office/word/2018/wordml/cex" xmlns:w16cid="http://schemas.microsoft.com/office/word/2016/wordml/cid" xmlns:w16="http://schemas.microsoft.com/office/word/2018/wordml" xmlns:w16du="http://schemas.microsoft.com/office/word/2023/wordml/word16du" xmlns:w16sdtdh="http://schemas.microsoft.com/office/word/2020/wordml/sdtdatahash" xmlns:w16sdtfl="http://schemas.microsoft.com/office/word/2024/wordml/sdtformatlock" xmlns:w16se="http://schemas.microsoft.com/office/word/2015/wordml/symex" xmlns:wpg="http://schemas.microsoft.com/office/word/2010/wordprocessingGroup" xmlns:wpi="http://schemas.microsoft.com/office/word/2010/wordprocessingInk" xmlns:wne="http://schemas.microsoft.com/office/word/2006/wordml" xmlns:wps="http://schemas.microsoft.com/office/word/2010/wordprocessingShape" mc:Ignorable="w14 w15 w16se w16cid w16 w16cex w16sdtdh w16sdtfl w16du wp14">
+  <w:footnote w:type="separator" w:id="-1">
+    <w:p>
+      <w:r>
+        <w:separator/>
+      </w:r>
+    </w:p>
+  </w:footnote>
+  <w:footnote w:type="continuationSeparator" w:id="0">
+    <w:p>
+      <w:r>
+        <w:continuationSeparator/>
+      </w:r>
+    </w:p>
+  </w:footnote>
+</w:footnotes>
 </file>
 
 <file path=word/numbering.xml><?xml version="1.0" encoding="utf-8"?>
@@ -1317,6 +1917,7 @@
   <w:style w:type="paragraph" w:default="1" w:styleId="Normal">
     <w:name w:val="Normal"/>
     <w:qFormat/>
+    <w:rsid w:val="00AC7933"/>
   </w:style>
   <w:style w:type="paragraph" w:styleId="Heading1">
     <w:name w:val="heading 1"/>
@@ -1405,7 +2006,6 @@
   <w:style w:type="character" w:default="1" w:styleId="DefaultParagraphFont">
     <w:name w:val="Default Paragraph Font"/>
     <w:uiPriority w:val="1"/>
-    <w:semiHidden/>
     <w:unhideWhenUsed/>
   </w:style>
   <w:style w:type="table" w:default="1" w:styleId="TableNormal">
@@ -1511,6 +2111,72 @@
     <w:rPr>
       <w:sz w:val="20"/>
       <w:szCs w:val="20"/>
+    </w:rPr>
+  </w:style>
+  <w:style w:type="paragraph" w:styleId="Header">
+    <w:name w:val="header"/>
+    <w:basedOn w:val="Normal"/>
+    <w:link w:val="HeaderChar"/>
+    <w:uiPriority w:val="99"/>
+    <w:unhideWhenUsed/>
+    <w:rsid w:val="00D962E5"/>
+    <w:pPr>
+      <w:tabs>
+        <w:tab w:val="center" w:pos="4513"/>
+        <w:tab w:val="right" w:pos="9026"/>
+      </w:tabs>
+    </w:pPr>
+  </w:style>
+  <w:style w:type="character" w:customStyle="1" w:styleId="HeaderChar">
+    <w:name w:val="Header Char"/>
+    <w:basedOn w:val="DefaultParagraphFont"/>
+    <w:link w:val="Header"/>
+    <w:uiPriority w:val="99"/>
+    <w:rsid w:val="00D962E5"/>
+  </w:style>
+  <w:style w:type="paragraph" w:styleId="Footer">
+    <w:name w:val="footer"/>
+    <w:basedOn w:val="Normal"/>
+    <w:link w:val="FooterChar"/>
+    <w:uiPriority w:val="99"/>
+    <w:unhideWhenUsed/>
+    <w:rsid w:val="00D962E5"/>
+    <w:pPr>
+      <w:tabs>
+        <w:tab w:val="center" w:pos="4513"/>
+        <w:tab w:val="right" w:pos="9026"/>
+      </w:tabs>
+    </w:pPr>
+  </w:style>
+  <w:style w:type="character" w:customStyle="1" w:styleId="FooterChar">
+    <w:name w:val="Footer Char"/>
+    <w:basedOn w:val="DefaultParagraphFont"/>
+    <w:link w:val="Footer"/>
+    <w:uiPriority w:val="99"/>
+    <w:rsid w:val="00D962E5"/>
+  </w:style>
+  <w:style w:type="character" w:styleId="UnresolvedMention">
+    <w:name w:val="Unresolved Mention"/>
+    <w:basedOn w:val="DefaultParagraphFont"/>
+    <w:uiPriority w:val="99"/>
+    <w:semiHidden/>
+    <w:unhideWhenUsed/>
+    <w:rsid w:val="00D962E5"/>
+    <w:rPr>
+      <w:color w:val="605E5C"/>
+      <w:shd w:val="clear" w:color="auto" w:fill="E1DFDD"/>
+    </w:rPr>
+  </w:style>
+  <w:style w:type="character" w:styleId="FollowedHyperlink">
+    <w:name w:val="FollowedHyperlink"/>
+    <w:basedOn w:val="DefaultParagraphFont"/>
+    <w:uiPriority w:val="99"/>
+    <w:semiHidden/>
+    <w:unhideWhenUsed/>
+    <w:rsid w:val="00D962E5"/>
+    <w:rPr>
+      <w:color w:val="954F72" w:themeColor="followedHyperlink"/>
+      <w:u w:val="single"/>
     </w:rPr>
   </w:style>
 </w:styles>

</xml_diff>

<commit_message>
fix: update resume documents for consistency and clarity in job titles and achievements
</commit_message>
<xml_diff>
--- a/public/Rohit_More_Resume_DevOps.docx
+++ b/public/Rohit_More_Resume_DevOps.docx
@@ -43,23 +43,7 @@
           <w:sz w:val="18"/>
           <w:szCs w:val="18"/>
         </w:rPr>
-        <w:t xml:space="preserve">DevOps Engineer | AWS • Docker • CI/CD • Linux | Production Infrastructure &amp; </w:t>
-      </w:r>
-      <w:r>
-        <w:rPr>
-          <w:rFonts w:asciiTheme="minorHAnsi" w:hAnsiTheme="minorHAnsi" w:cstheme="minorHAnsi"/>
-          <w:sz w:val="18"/>
-          <w:szCs w:val="18"/>
-        </w:rPr>
-        <w:t>Open-Source</w:t>
-      </w:r>
-      <w:r>
-        <w:rPr>
-          <w:rFonts w:asciiTheme="minorHAnsi" w:hAnsiTheme="minorHAnsi" w:cstheme="minorHAnsi"/>
-          <w:sz w:val="18"/>
-          <w:szCs w:val="18"/>
-        </w:rPr>
-        <w:t xml:space="preserve"> Networking Projects</w:t>
+        <w:t>DevOps Engineer | AWS • Docker • CI/CD • Linux | Production Infrastructure &amp; Open-Source Networking Projects</w:t>
       </w:r>
     </w:p>
     <w:p>
@@ -113,7 +97,7 @@
             <w:sz w:val="19"/>
             <w:szCs w:val="19"/>
           </w:rPr>
-          <w:t>github.co</w:t>
+          <w:t>github.com</w:t>
         </w:r>
         <w:r>
           <w:rPr>
@@ -122,28 +106,8 @@
             <w:sz w:val="19"/>
             <w:szCs w:val="19"/>
           </w:rPr>
-          <w:t>m</w:t>
+          <w:t>/rohitbytecode</w:t>
         </w:r>
-        <w:r>
-          <w:rPr>
-            <w:rStyle w:val="Hyperlink"/>
-            <w:rFonts w:asciiTheme="minorHAnsi" w:hAnsiTheme="minorHAnsi" w:cstheme="minorHAnsi"/>
-            <w:sz w:val="19"/>
-            <w:szCs w:val="19"/>
-          </w:rPr>
-          <w:t>/</w:t>
-        </w:r>
-        <w:proofErr w:type="spellStart"/>
-        <w:r>
-          <w:rPr>
-            <w:rStyle w:val="Hyperlink"/>
-            <w:rFonts w:asciiTheme="minorHAnsi" w:hAnsiTheme="minorHAnsi" w:cstheme="minorHAnsi"/>
-            <w:sz w:val="19"/>
-            <w:szCs w:val="19"/>
-          </w:rPr>
-          <w:t>rohitbytecode</w:t>
-        </w:r>
-        <w:proofErr w:type="spellEnd"/>
       </w:hyperlink>
     </w:p>
     <w:p>
@@ -178,7 +142,13 @@
         <w:rPr>
           <w:rFonts w:asciiTheme="minorHAnsi" w:hAnsiTheme="minorHAnsi" w:cstheme="minorHAnsi"/>
         </w:rPr>
-        <w:t xml:space="preserve">Software Engineer with 2+ years of hands-on experience deploying, monitoring, and maintaining production infrastructure for a healthcare SaaS platform. Responsible for the full deployment lifecycle on AWS </w:t>
+        <w:t xml:space="preserve">DevOps Engineer </w:t>
+      </w:r>
+      <w:r>
+        <w:rPr>
+          <w:rFonts w:asciiTheme="minorHAnsi" w:hAnsiTheme="minorHAnsi" w:cstheme="minorHAnsi"/>
+        </w:rPr>
+        <w:t xml:space="preserve">with 2+ years of hands-on experience deploying, monitoring, and maintaining production infrastructure for a healthcare SaaS platform. Responsible for the full deployment lifecycle on AWS </w:t>
       </w:r>
       <w:r>
         <w:rPr>
@@ -190,21 +160,7 @@
         <w:rPr>
           <w:rFonts w:asciiTheme="minorHAnsi" w:hAnsiTheme="minorHAnsi" w:cstheme="minorHAnsi"/>
         </w:rPr>
-        <w:t xml:space="preserve"> EC2 provisioning, IAM and Security Group configuration, Nginx reverse proxy/HTTPS setup, PM2 process management, and CI/CD pipelines via GitHub Actions. Experienced diagnosing infrastructure and networking issues (LAN connectivity, port exhaustion, TLS misconfiguration) in live production environments, and building observability stacks with Prometheus, </w:t>
-      </w:r>
-      <w:proofErr w:type="spellStart"/>
-      <w:r>
-        <w:rPr>
-          <w:rFonts w:asciiTheme="minorHAnsi" w:hAnsiTheme="minorHAnsi" w:cstheme="minorHAnsi"/>
-        </w:rPr>
-        <w:t>OpenTelemetry</w:t>
-      </w:r>
-      <w:proofErr w:type="spellEnd"/>
-      <w:r>
-        <w:rPr>
-          <w:rFonts w:asciiTheme="minorHAnsi" w:hAnsiTheme="minorHAnsi" w:cstheme="minorHAnsi"/>
-        </w:rPr>
-        <w:t>, and structured logging. Self-directed learner actively building practical experience with Kubernetes, Jenkins, GitLab CI/CD, and Terraform.</w:t>
+        <w:t xml:space="preserve"> EC2 provisioning, IAM and Security Group configuration, Nginx reverse proxy/HTTPS setup, PM2 process management, and CI/CD pipelines via GitHub Actions. Experienced diagnosing infrastructure and networking issues (LAN connectivity, port exhaustion, TLS misconfiguration) in live production environments, and building observability stacks with Prometheus, OpenTelemetry, and structured logging. Self-directed learner actively building practical experience with Kubernetes, Jenkins, GitLab CI/CD, and Terraform.</w:t>
       </w:r>
     </w:p>
     <w:p>
@@ -247,7 +203,13 @@
         <w:rPr>
           <w:rFonts w:asciiTheme="minorHAnsi" w:hAnsiTheme="minorHAnsi" w:cstheme="minorHAnsi"/>
         </w:rPr>
-        <w:t>Linux (Ubuntu), Windows Server</w:t>
+        <w:t>Linux (Ubuntu)</w:t>
+      </w:r>
+      <w:r>
+        <w:rPr>
+          <w:rFonts w:asciiTheme="minorHAnsi" w:hAnsiTheme="minorHAnsi" w:cstheme="minorHAnsi"/>
+        </w:rPr>
+        <w:t xml:space="preserve"> Server</w:t>
       </w:r>
     </w:p>
     <w:p>
@@ -351,25 +313,7 @@
           <w:b/>
           <w:bCs/>
         </w:rPr>
-        <w:t xml:space="preserve">Web/Proxy &amp; Process </w:t>
-      </w:r>
-      <w:proofErr w:type="spellStart"/>
-      <w:r>
-        <w:rPr>
-          <w:rFonts w:asciiTheme="minorHAnsi" w:hAnsiTheme="minorHAnsi" w:cstheme="minorHAnsi"/>
-          <w:b/>
-          <w:bCs/>
-        </w:rPr>
-        <w:t>Mgmt</w:t>
-      </w:r>
-      <w:proofErr w:type="spellEnd"/>
-      <w:r>
-        <w:rPr>
-          <w:rFonts w:asciiTheme="minorHAnsi" w:hAnsiTheme="minorHAnsi" w:cstheme="minorHAnsi"/>
-          <w:b/>
-          <w:bCs/>
-        </w:rPr>
-        <w:t xml:space="preserve">: </w:t>
+        <w:t xml:space="preserve">Web/Proxy &amp; Process Mgmt: </w:t>
       </w:r>
       <w:r>
         <w:rPr>
@@ -409,21 +353,7 @@
         <w:rPr>
           <w:rFonts w:asciiTheme="minorHAnsi" w:hAnsiTheme="minorHAnsi" w:cstheme="minorHAnsi"/>
         </w:rPr>
-        <w:t xml:space="preserve">LAN configuration &amp; troubleshooting, </w:t>
-      </w:r>
-      <w:proofErr w:type="spellStart"/>
-      <w:r>
-        <w:rPr>
-          <w:rFonts w:asciiTheme="minorHAnsi" w:hAnsiTheme="minorHAnsi" w:cstheme="minorHAnsi"/>
-        </w:rPr>
-        <w:t>mDNS</w:t>
-      </w:r>
-      <w:proofErr w:type="spellEnd"/>
-      <w:r>
-        <w:rPr>
-          <w:rFonts w:asciiTheme="minorHAnsi" w:hAnsiTheme="minorHAnsi" w:cstheme="minorHAnsi"/>
-        </w:rPr>
-        <w:t>/hostname resolution, TCP/port management, HTTPS/TLS, DNS fundamentals</w:t>
+        <w:t>LAN configuration &amp; troubleshooting, mDNS/hostname resolution, TCP/port management, HTTPS/TLS, DNS fundamentals</w:t>
       </w:r>
     </w:p>
     <w:p>
@@ -445,21 +375,7 @@
         <w:rPr>
           <w:rFonts w:asciiTheme="minorHAnsi" w:hAnsiTheme="minorHAnsi" w:cstheme="minorHAnsi"/>
         </w:rPr>
-        <w:t xml:space="preserve">Prometheus, </w:t>
-      </w:r>
-      <w:proofErr w:type="spellStart"/>
-      <w:r>
-        <w:rPr>
-          <w:rFonts w:asciiTheme="minorHAnsi" w:hAnsiTheme="minorHAnsi" w:cstheme="minorHAnsi"/>
-        </w:rPr>
-        <w:t>OpenTelemetry</w:t>
-      </w:r>
-      <w:proofErr w:type="spellEnd"/>
-      <w:r>
-        <w:rPr>
-          <w:rFonts w:asciiTheme="minorHAnsi" w:hAnsiTheme="minorHAnsi" w:cstheme="minorHAnsi"/>
-        </w:rPr>
-        <w:t>, Pino (structured logging)</w:t>
+        <w:t>Prometheus, OpenTelemetry, Pino (structured logging)</w:t>
       </w:r>
     </w:p>
     <w:p>
@@ -703,21 +619,7 @@
         <w:rPr>
           <w:rFonts w:asciiTheme="minorHAnsi" w:hAnsiTheme="minorHAnsi" w:cstheme="minorHAnsi"/>
         </w:rPr>
-        <w:t xml:space="preserve"> Prometheus metrics, </w:t>
-      </w:r>
-      <w:proofErr w:type="spellStart"/>
-      <w:r>
-        <w:rPr>
-          <w:rFonts w:asciiTheme="minorHAnsi" w:hAnsiTheme="minorHAnsi" w:cstheme="minorHAnsi"/>
-        </w:rPr>
-        <w:t>OpenTelemetry</w:t>
-      </w:r>
-      <w:proofErr w:type="spellEnd"/>
-      <w:r>
-        <w:rPr>
-          <w:rFonts w:asciiTheme="minorHAnsi" w:hAnsiTheme="minorHAnsi" w:cstheme="minorHAnsi"/>
-        </w:rPr>
-        <w:t xml:space="preserve"> tracing, and Pino structured logging </w:t>
+        <w:t xml:space="preserve"> Prometheus metrics, OpenTelemetry tracing, and Pino structured logging </w:t>
       </w:r>
       <w:r>
         <w:rPr>
@@ -748,21 +650,7 @@
         <w:rPr>
           <w:rFonts w:asciiTheme="minorHAnsi" w:hAnsiTheme="minorHAnsi" w:cstheme="minorHAnsi"/>
         </w:rPr>
-        <w:t>Automated nightly backup jobs (node-</w:t>
-      </w:r>
-      <w:proofErr w:type="spellStart"/>
-      <w:r>
-        <w:rPr>
-          <w:rFonts w:asciiTheme="minorHAnsi" w:hAnsiTheme="minorHAnsi" w:cstheme="minorHAnsi"/>
-        </w:rPr>
-        <w:t>cron</w:t>
-      </w:r>
-      <w:proofErr w:type="spellEnd"/>
-      <w:r>
-        <w:rPr>
-          <w:rFonts w:asciiTheme="minorHAnsi" w:hAnsiTheme="minorHAnsi" w:cstheme="minorHAnsi"/>
-        </w:rPr>
-        <w:t xml:space="preserve"> scheduled tasks integrating with the Google Drive API via a service account) as part of routine infrastructure maintenance.</w:t>
+        <w:t>Automated nightly backup jobs (node-cron scheduled tasks integrating with the Google Drive API via a service account) as part of routine infrastructure maintenance.</w:t>
       </w:r>
     </w:p>
     <w:p>
@@ -792,17 +680,31 @@
         <w:spacing w:before="90" w:after="40"/>
         <w:rPr>
           <w:rFonts w:asciiTheme="minorHAnsi" w:hAnsiTheme="minorHAnsi" w:cstheme="minorHAnsi"/>
-        </w:rPr>
-      </w:pPr>
-      <w:r>
-        <w:rPr>
-          <w:rFonts w:asciiTheme="minorHAnsi" w:hAnsiTheme="minorHAnsi" w:cstheme="minorHAnsi"/>
           <w:b/>
           <w:bCs/>
           <w:color w:val="1F2937"/>
           <w:spacing w:val="20"/>
         </w:rPr>
-        <w:t>ACHIEVEMENTS</w:t>
+      </w:pPr>
+      <w:r>
+        <w:rPr>
+          <w:rFonts w:asciiTheme="minorHAnsi" w:hAnsiTheme="minorHAnsi" w:cstheme="minorHAnsi"/>
+          <w:b/>
+          <w:bCs/>
+          <w:color w:val="1F2937"/>
+          <w:spacing w:val="20"/>
+        </w:rPr>
+        <w:t xml:space="preserve">ENGINEERING </w:t>
+      </w:r>
+      <w:r>
+        <w:rPr>
+          <w:rFonts w:asciiTheme="minorHAnsi" w:hAnsiTheme="minorHAnsi" w:cstheme="minorHAnsi"/>
+          <w:b/>
+          <w:bCs/>
+          <w:color w:val="1F2937"/>
+          <w:spacing w:val="20"/>
+        </w:rPr>
+        <w:t>HIGHLIGHTS</w:t>
       </w:r>
     </w:p>
     <w:p>
@@ -821,7 +723,13 @@
         <w:rPr>
           <w:rFonts w:asciiTheme="minorHAnsi" w:hAnsiTheme="minorHAnsi" w:cstheme="minorHAnsi"/>
         </w:rPr>
-        <w:t>Recovered EC2 instance access after an SSH firewall lockout, restoring administrative access without downtime.</w:t>
+        <w:t>Recovered EC2 in</w:t>
+      </w:r>
+      <w:r>
+        <w:rPr>
+          <w:rFonts w:asciiTheme="minorHAnsi" w:hAnsiTheme="minorHAnsi" w:cstheme="minorHAnsi"/>
+        </w:rPr>
+        <w:t>stance access after an SSH firewall lockout.</w:t>
       </w:r>
     </w:p>
     <w:p>
@@ -878,23 +786,7 @@
         <w:rPr>
           <w:rFonts w:asciiTheme="minorHAnsi" w:hAnsiTheme="minorHAnsi" w:cstheme="minorHAnsi"/>
         </w:rPr>
-        <w:t>Fixed LAN hostname resolution failures using a runtime IP discovery approach (</w:t>
-      </w:r>
-      <w:proofErr w:type="spellStart"/>
-      <w:proofErr w:type="gramStart"/>
-      <w:r>
-        <w:rPr>
-          <w:rFonts w:asciiTheme="minorHAnsi" w:hAnsiTheme="minorHAnsi" w:cstheme="minorHAnsi"/>
-        </w:rPr>
-        <w:t>os.networkInterfaces</w:t>
-      </w:r>
-      <w:proofErr w:type="spellEnd"/>
-      <w:proofErr w:type="gramEnd"/>
-      <w:r>
-        <w:rPr>
-          <w:rFonts w:asciiTheme="minorHAnsi" w:hAnsiTheme="minorHAnsi" w:cstheme="minorHAnsi"/>
-        </w:rPr>
-        <w:t xml:space="preserve">()). </w:t>
+        <w:t xml:space="preserve">Fixed LAN hostname resolution failures using a runtime IP discovery approach (os.networkInterfaces()). </w:t>
       </w:r>
     </w:p>
     <w:p>
@@ -1020,36 +912,7 @@
             <w:sz w:val="19"/>
             <w:szCs w:val="19"/>
           </w:rPr>
-          <w:t>github.com/</w:t>
-        </w:r>
-        <w:proofErr w:type="spellStart"/>
-        <w:r>
-          <w:rPr>
-            <w:rStyle w:val="Hyperlink"/>
-            <w:rFonts w:asciiTheme="minorHAnsi" w:hAnsiTheme="minorHAnsi" w:cstheme="minorHAnsi"/>
-            <w:sz w:val="19"/>
-            <w:szCs w:val="19"/>
-          </w:rPr>
-          <w:t>r</w:t>
-        </w:r>
-        <w:r>
-          <w:rPr>
-            <w:rStyle w:val="Hyperlink"/>
-            <w:rFonts w:asciiTheme="minorHAnsi" w:hAnsiTheme="minorHAnsi" w:cstheme="minorHAnsi"/>
-            <w:sz w:val="19"/>
-            <w:szCs w:val="19"/>
-          </w:rPr>
-          <w:t>ohitbytecode</w:t>
-        </w:r>
-        <w:proofErr w:type="spellEnd"/>
-        <w:r>
-          <w:rPr>
-            <w:rStyle w:val="Hyperlink"/>
-            <w:rFonts w:asciiTheme="minorHAnsi" w:hAnsiTheme="minorHAnsi" w:cstheme="minorHAnsi"/>
-            <w:sz w:val="19"/>
-            <w:szCs w:val="19"/>
-          </w:rPr>
-          <w:t>/Horizon</w:t>
+          <w:t>github.com/rohitbytecode/Horizon</w:t>
         </w:r>
       </w:hyperlink>
     </w:p>
@@ -1145,36 +1008,7 @@
             <w:sz w:val="19"/>
             <w:szCs w:val="19"/>
           </w:rPr>
-          <w:t>github.com/</w:t>
-        </w:r>
-        <w:proofErr w:type="spellStart"/>
-        <w:r>
-          <w:rPr>
-            <w:rStyle w:val="Hyperlink"/>
-            <w:rFonts w:asciiTheme="minorHAnsi" w:hAnsiTheme="minorHAnsi" w:cstheme="minorHAnsi"/>
-            <w:sz w:val="19"/>
-            <w:szCs w:val="19"/>
-          </w:rPr>
-          <w:t>rohitbytecod</w:t>
-        </w:r>
-        <w:r>
-          <w:rPr>
-            <w:rStyle w:val="Hyperlink"/>
-            <w:rFonts w:asciiTheme="minorHAnsi" w:hAnsiTheme="minorHAnsi" w:cstheme="minorHAnsi"/>
-            <w:sz w:val="19"/>
-            <w:szCs w:val="19"/>
-          </w:rPr>
-          <w:t>e</w:t>
-        </w:r>
-        <w:proofErr w:type="spellEnd"/>
-        <w:r>
-          <w:rPr>
-            <w:rStyle w:val="Hyperlink"/>
-            <w:rFonts w:asciiTheme="minorHAnsi" w:hAnsiTheme="minorHAnsi" w:cstheme="minorHAnsi"/>
-            <w:sz w:val="19"/>
-            <w:szCs w:val="19"/>
-          </w:rPr>
-          <w:t>/HMS-SaaS</w:t>
+          <w:t>github.com/rohitbytecode/HMS-SaaS</w:t>
         </w:r>
       </w:hyperlink>
     </w:p>
@@ -2006,6 +1840,7 @@
   <w:style w:type="character" w:default="1" w:styleId="DefaultParagraphFont">
     <w:name w:val="Default Paragraph Font"/>
     <w:uiPriority w:val="1"/>
+    <w:semiHidden/>
     <w:unhideWhenUsed/>
   </w:style>
   <w:style w:type="table" w:default="1" w:styleId="TableNormal">
@@ -2177,6 +2012,18 @@
     <w:rPr>
       <w:color w:val="954F72" w:themeColor="followedHyperlink"/>
       <w:u w:val="single"/>
+    </w:rPr>
+  </w:style>
+  <w:style w:type="paragraph" w:styleId="NormalWeb">
+    <w:name w:val="Normal (Web)"/>
+    <w:basedOn w:val="Normal"/>
+    <w:uiPriority w:val="99"/>
+    <w:semiHidden/>
+    <w:unhideWhenUsed/>
+    <w:rsid w:val="00812C75"/>
+    <w:rPr>
+      <w:sz w:val="24"/>
+      <w:szCs w:val="24"/>
     </w:rPr>
   </w:style>
 </w:styles>

</xml_diff>

<commit_message>
fix: update DevOps resume to include Grafana in monitoring tools
</commit_message>
<xml_diff>
--- a/public/Rohit_More_Resume_DevOps.docx
+++ b/public/Rohit_More_Resume_DevOps.docx
@@ -106,8 +106,19 @@
             <w:sz w:val="19"/>
             <w:szCs w:val="19"/>
           </w:rPr>
-          <w:t>/rohitbytecode</w:t>
+          <w:t>/</w:t>
         </w:r>
+        <w:proofErr w:type="spellStart"/>
+        <w:r>
+          <w:rPr>
+            <w:rStyle w:val="Hyperlink"/>
+            <w:rFonts w:asciiTheme="minorHAnsi" w:hAnsiTheme="minorHAnsi" w:cstheme="minorHAnsi"/>
+            <w:sz w:val="19"/>
+            <w:szCs w:val="19"/>
+          </w:rPr>
+          <w:t>rohitbytecode</w:t>
+        </w:r>
+        <w:proofErr w:type="spellEnd"/>
       </w:hyperlink>
     </w:p>
     <w:p>
@@ -160,7 +171,21 @@
         <w:rPr>
           <w:rFonts w:asciiTheme="minorHAnsi" w:hAnsiTheme="minorHAnsi" w:cstheme="minorHAnsi"/>
         </w:rPr>
-        <w:t xml:space="preserve"> EC2 provisioning, IAM and Security Group configuration, Nginx reverse proxy/HTTPS setup, PM2 process management, and CI/CD pipelines via GitHub Actions. Experienced diagnosing infrastructure and networking issues (LAN connectivity, port exhaustion, TLS misconfiguration) in live production environments, and building observability stacks with Prometheus, OpenTelemetry, and structured logging. Self-directed learner actively building practical experience with Kubernetes, Jenkins, GitLab CI/CD, and Terraform.</w:t>
+        <w:t xml:space="preserve"> EC2 provisioning, IAM and Security Group configuration, Nginx reverse proxy/HTTPS setup, PM2 process management, and CI/CD pipelines via GitHub Actions. Experienced diagnosing infrastructure and networking issues (LAN connectivity, port exhaustion, TLS misconfiguration) in live production environments, and building observability stacks with Prometheus, </w:t>
+      </w:r>
+      <w:proofErr w:type="spellStart"/>
+      <w:r>
+        <w:rPr>
+          <w:rFonts w:asciiTheme="minorHAnsi" w:hAnsiTheme="minorHAnsi" w:cstheme="minorHAnsi"/>
+        </w:rPr>
+        <w:t>OpenTelemetry</w:t>
+      </w:r>
+      <w:proofErr w:type="spellEnd"/>
+      <w:r>
+        <w:rPr>
+          <w:rFonts w:asciiTheme="minorHAnsi" w:hAnsiTheme="minorHAnsi" w:cstheme="minorHAnsi"/>
+        </w:rPr>
+        <w:t>, and structured logging. Self-directed learner actively building practical experience with Kubernetes, Jenkins, GitLab CI/CD, and Terraform.</w:t>
       </w:r>
     </w:p>
     <w:p>
@@ -313,7 +338,25 @@
           <w:b/>
           <w:bCs/>
         </w:rPr>
-        <w:t xml:space="preserve">Web/Proxy &amp; Process Mgmt: </w:t>
+        <w:t xml:space="preserve">Web/Proxy &amp; Process </w:t>
+      </w:r>
+      <w:proofErr w:type="spellStart"/>
+      <w:r>
+        <w:rPr>
+          <w:rFonts w:asciiTheme="minorHAnsi" w:hAnsiTheme="minorHAnsi" w:cstheme="minorHAnsi"/>
+          <w:b/>
+          <w:bCs/>
+        </w:rPr>
+        <w:t>Mgmt</w:t>
+      </w:r>
+      <w:proofErr w:type="spellEnd"/>
+      <w:r>
+        <w:rPr>
+          <w:rFonts w:asciiTheme="minorHAnsi" w:hAnsiTheme="minorHAnsi" w:cstheme="minorHAnsi"/>
+          <w:b/>
+          <w:bCs/>
+        </w:rPr>
+        <w:t xml:space="preserve">: </w:t>
       </w:r>
       <w:r>
         <w:rPr>
@@ -353,7 +396,21 @@
         <w:rPr>
           <w:rFonts w:asciiTheme="minorHAnsi" w:hAnsiTheme="minorHAnsi" w:cstheme="minorHAnsi"/>
         </w:rPr>
-        <w:t>LAN configuration &amp; troubleshooting, mDNS/hostname resolution, TCP/port management, HTTPS/TLS, DNS fundamentals</w:t>
+        <w:t xml:space="preserve">LAN configuration &amp; troubleshooting, </w:t>
+      </w:r>
+      <w:proofErr w:type="spellStart"/>
+      <w:r>
+        <w:rPr>
+          <w:rFonts w:asciiTheme="minorHAnsi" w:hAnsiTheme="minorHAnsi" w:cstheme="minorHAnsi"/>
+        </w:rPr>
+        <w:t>mDNS</w:t>
+      </w:r>
+      <w:proofErr w:type="spellEnd"/>
+      <w:r>
+        <w:rPr>
+          <w:rFonts w:asciiTheme="minorHAnsi" w:hAnsiTheme="minorHAnsi" w:cstheme="minorHAnsi"/>
+        </w:rPr>
+        <w:t>/hostname resolution, TCP/port management, HTTPS/TLS, DNS fundamentals</w:t>
       </w:r>
     </w:p>
     <w:p>
@@ -375,7 +432,33 @@
         <w:rPr>
           <w:rFonts w:asciiTheme="minorHAnsi" w:hAnsiTheme="minorHAnsi" w:cstheme="minorHAnsi"/>
         </w:rPr>
-        <w:t>Prometheus, OpenTelemetry, Pino (structured logging)</w:t>
+        <w:t xml:space="preserve">Prometheus, </w:t>
+      </w:r>
+      <w:proofErr w:type="spellStart"/>
+      <w:r>
+        <w:rPr>
+          <w:rFonts w:asciiTheme="minorHAnsi" w:hAnsiTheme="minorHAnsi" w:cstheme="minorHAnsi"/>
+        </w:rPr>
+        <w:t>OpenTelemetry</w:t>
+      </w:r>
+      <w:proofErr w:type="spellEnd"/>
+      <w:r>
+        <w:rPr>
+          <w:rFonts w:asciiTheme="minorHAnsi" w:hAnsiTheme="minorHAnsi" w:cstheme="minorHAnsi"/>
+        </w:rPr>
+        <w:t xml:space="preserve">, </w:t>
+      </w:r>
+      <w:r>
+        <w:rPr>
+          <w:rFonts w:asciiTheme="minorHAnsi" w:hAnsiTheme="minorHAnsi" w:cstheme="minorHAnsi"/>
+        </w:rPr>
+        <w:t xml:space="preserve">Grafana, </w:t>
+      </w:r>
+      <w:r>
+        <w:rPr>
+          <w:rFonts w:asciiTheme="minorHAnsi" w:hAnsiTheme="minorHAnsi" w:cstheme="minorHAnsi"/>
+        </w:rPr>
+        <w:t>Pino (structured logging)</w:t>
       </w:r>
     </w:p>
     <w:p>
@@ -619,7 +702,21 @@
         <w:rPr>
           <w:rFonts w:asciiTheme="minorHAnsi" w:hAnsiTheme="minorHAnsi" w:cstheme="minorHAnsi"/>
         </w:rPr>
-        <w:t xml:space="preserve"> Prometheus metrics, OpenTelemetry tracing, and Pino structured logging </w:t>
+        <w:t xml:space="preserve"> Prometheus metrics, </w:t>
+      </w:r>
+      <w:proofErr w:type="spellStart"/>
+      <w:r>
+        <w:rPr>
+          <w:rFonts w:asciiTheme="minorHAnsi" w:hAnsiTheme="minorHAnsi" w:cstheme="minorHAnsi"/>
+        </w:rPr>
+        <w:t>OpenTelemetry</w:t>
+      </w:r>
+      <w:proofErr w:type="spellEnd"/>
+      <w:r>
+        <w:rPr>
+          <w:rFonts w:asciiTheme="minorHAnsi" w:hAnsiTheme="minorHAnsi" w:cstheme="minorHAnsi"/>
+        </w:rPr>
+        <w:t xml:space="preserve"> tracing, and Pino structured logging </w:t>
       </w:r>
       <w:r>
         <w:rPr>
@@ -650,7 +747,21 @@
         <w:rPr>
           <w:rFonts w:asciiTheme="minorHAnsi" w:hAnsiTheme="minorHAnsi" w:cstheme="minorHAnsi"/>
         </w:rPr>
-        <w:t>Automated nightly backup jobs (node-cron scheduled tasks integrating with the Google Drive API via a service account) as part of routine infrastructure maintenance.</w:t>
+        <w:t>Automated nightly backup jobs (node-</w:t>
+      </w:r>
+      <w:proofErr w:type="spellStart"/>
+      <w:r>
+        <w:rPr>
+          <w:rFonts w:asciiTheme="minorHAnsi" w:hAnsiTheme="minorHAnsi" w:cstheme="minorHAnsi"/>
+        </w:rPr>
+        <w:t>cron</w:t>
+      </w:r>
+      <w:proofErr w:type="spellEnd"/>
+      <w:r>
+        <w:rPr>
+          <w:rFonts w:asciiTheme="minorHAnsi" w:hAnsiTheme="minorHAnsi" w:cstheme="minorHAnsi"/>
+        </w:rPr>
+        <w:t xml:space="preserve"> scheduled tasks integrating with the Google Drive API via a service account) as part of routine infrastructure maintenance.</w:t>
       </w:r>
     </w:p>
     <w:p>
@@ -786,7 +897,21 @@
         <w:rPr>
           <w:rFonts w:asciiTheme="minorHAnsi" w:hAnsiTheme="minorHAnsi" w:cstheme="minorHAnsi"/>
         </w:rPr>
-        <w:t xml:space="preserve">Fixed LAN hostname resolution failures using a runtime IP discovery approach (os.networkInterfaces()). </w:t>
+        <w:t>Fixed LAN hostname resolution failures using a runtime IP discovery approach (</w:t>
+      </w:r>
+      <w:proofErr w:type="spellStart"/>
+      <w:r>
+        <w:rPr>
+          <w:rFonts w:asciiTheme="minorHAnsi" w:hAnsiTheme="minorHAnsi" w:cstheme="minorHAnsi"/>
+        </w:rPr>
+        <w:t>os.networkInterfaces</w:t>
+      </w:r>
+      <w:proofErr w:type="spellEnd"/>
+      <w:r>
+        <w:rPr>
+          <w:rFonts w:asciiTheme="minorHAnsi" w:hAnsiTheme="minorHAnsi" w:cstheme="minorHAnsi"/>
+        </w:rPr>
+        <w:t xml:space="preserve">()). </w:t>
       </w:r>
     </w:p>
     <w:p>
@@ -912,7 +1037,27 @@
             <w:sz w:val="19"/>
             <w:szCs w:val="19"/>
           </w:rPr>
-          <w:t>github.com/rohitbytecode/Horizon</w:t>
+          <w:t>github.com/</w:t>
+        </w:r>
+        <w:proofErr w:type="spellStart"/>
+        <w:r>
+          <w:rPr>
+            <w:rStyle w:val="Hyperlink"/>
+            <w:rFonts w:asciiTheme="minorHAnsi" w:hAnsiTheme="minorHAnsi" w:cstheme="minorHAnsi"/>
+            <w:sz w:val="19"/>
+            <w:szCs w:val="19"/>
+          </w:rPr>
+          <w:t>rohitbytecode</w:t>
+        </w:r>
+        <w:proofErr w:type="spellEnd"/>
+        <w:r>
+          <w:rPr>
+            <w:rStyle w:val="Hyperlink"/>
+            <w:rFonts w:asciiTheme="minorHAnsi" w:hAnsiTheme="minorHAnsi" w:cstheme="minorHAnsi"/>
+            <w:sz w:val="19"/>
+            <w:szCs w:val="19"/>
+          </w:rPr>
+          <w:t>/Horizon</w:t>
         </w:r>
       </w:hyperlink>
     </w:p>
@@ -1008,7 +1153,27 @@
             <w:sz w:val="19"/>
             <w:szCs w:val="19"/>
           </w:rPr>
-          <w:t>github.com/rohitbytecode/HMS-SaaS</w:t>
+          <w:t>github.com/</w:t>
+        </w:r>
+        <w:proofErr w:type="spellStart"/>
+        <w:r>
+          <w:rPr>
+            <w:rStyle w:val="Hyperlink"/>
+            <w:rFonts w:asciiTheme="minorHAnsi" w:hAnsiTheme="minorHAnsi" w:cstheme="minorHAnsi"/>
+            <w:sz w:val="19"/>
+            <w:szCs w:val="19"/>
+          </w:rPr>
+          <w:t>rohitbytecode</w:t>
+        </w:r>
+        <w:proofErr w:type="spellEnd"/>
+        <w:r>
+          <w:rPr>
+            <w:rStyle w:val="Hyperlink"/>
+            <w:rFonts w:asciiTheme="minorHAnsi" w:hAnsiTheme="minorHAnsi" w:cstheme="minorHAnsi"/>
+            <w:sz w:val="19"/>
+            <w:szCs w:val="19"/>
+          </w:rPr>
+          <w:t>/HMS-SaaS</w:t>
         </w:r>
       </w:hyperlink>
     </w:p>

</xml_diff>